<commit_message>
Fix speaker names in Women FGD: S17=Yuvraj (male co-moderator), S14 female (name mis-transcribed)
Voice-pitch analysis: Speaker 17 is the only male (116Hz) = Yuvraj co-moderator
who asks questions. Speaker 14 confirmed female (258Hz); 'Arun Nagar' was an
ASR mis-transcription, relabeled name-unclear.

Co-Authored-By: Claude Opus 4.8 <noreply@anthropic.com>
Claude-Session: https://claude.ai/code/session_014UPior9FGpKTJVtrdjd1Rc
</commit_message>
<xml_diff>
--- a/transcripts/Delhi FGD 2 - Women Aspirants (named).docx
+++ b/transcripts/Delhi FGD 2 - Women Aspirants (named).docx
@@ -39,9 +39,10 @@
     <w:p>
       <w:r>
         <w:rPr>
+          <w:b/>
           <w:sz w:val="20"/>
         </w:rPr>
-        <w:t>Speaker 1 = Varna (moderator)</w:t>
+        <w:t>Speaker 1 = Varna  — moderator</w:t>
         <w:br/>
       </w:r>
       <w:r>
@@ -132,7 +133,7 @@
         <w:rPr>
           <w:sz w:val="20"/>
         </w:rPr>
-        <w:t>Speaker 14 = Arun Nagar</w:t>
+        <w:t>Speaker 14 = name unclear</w:t>
         <w:br/>
       </w:r>
       <w:r>
@@ -144,10 +145,17 @@
       </w:r>
       <w:r>
         <w:rPr>
-          <w:i/>
           <w:sz w:val="20"/>
         </w:rPr>
-        <w:t>Speakers 16, 17 = not identifiable from introductions (brief/overlapping speech)</w:t>
+        <w:t>Speaker 16 = name unclear</w:t>
+        <w:br/>
+      </w:r>
+      <w:r>
+        <w:rPr>
+          <w:b/>
+          <w:sz w:val="20"/>
+        </w:rPr>
+        <w:t>Speaker 17 = Yuvraj  — co-moderator (male)</w:t>
         <w:br/>
       </w:r>
     </w:p>
@@ -158,7 +166,7 @@
           <w:color w:val="AA5555"/>
           <w:sz w:val="16"/>
         </w:rPr>
-        <w:t>Note: names auto-matched to self-introductions; verify where attribution matters. 'Speaker 8' combines two participants (Khushi &amp; Rupita) that the diarizer merged.</w:t>
+        <w:t>Moderators: Varna (Speaker 1) and Yuvraj (Speaker 17, the male voice). Names auto-matched to self-introductions + voice-pitch check; verify where attribution matters. 'Speaker 8' merges two participants (Khushi &amp; Rupita). Speaker 14 is female — her name was mis-transcribed as 'Arun Nagar'.</w:t>
       </w:r>
     </w:p>
     <w:p>
@@ -173,9 +181,9 @@
       <w:r>
         <w:rPr>
           <w:b/>
-          <w:color w:val="2E74B5"/>
-        </w:rPr>
-        <w:t xml:space="preserve">Varna (moderator) (Speaker 1)  </w:t>
+          <w:color w:val="B52E2E"/>
+        </w:rPr>
+        <w:t xml:space="preserve">Varna (Speaker 1)  </w:t>
       </w:r>
       <w:r>
         <w:rPr>
@@ -223,9 +231,9 @@
       <w:r>
         <w:rPr>
           <w:b/>
-          <w:color w:val="2E74B5"/>
-        </w:rPr>
-        <w:t xml:space="preserve">Varna (moderator) (Speaker 1)  </w:t>
+          <w:color w:val="B52E2E"/>
+        </w:rPr>
+        <w:t xml:space="preserve">Varna (Speaker 1)  </w:t>
       </w:r>
       <w:r>
         <w:rPr>
@@ -273,9 +281,9 @@
       <w:r>
         <w:rPr>
           <w:b/>
-          <w:color w:val="2E74B5"/>
-        </w:rPr>
-        <w:t xml:space="preserve">Varna (moderator) (Speaker 1)  </w:t>
+          <w:color w:val="B52E2E"/>
+        </w:rPr>
+        <w:t xml:space="preserve">Varna (Speaker 1)  </w:t>
       </w:r>
       <w:r>
         <w:rPr>
@@ -323,9 +331,9 @@
       <w:r>
         <w:rPr>
           <w:b/>
-          <w:color w:val="2E74B5"/>
-        </w:rPr>
-        <w:t xml:space="preserve">Varna (moderator) (Speaker 1)  </w:t>
+          <w:color w:val="B52E2E"/>
+        </w:rPr>
+        <w:t xml:space="preserve">Varna (Speaker 1)  </w:t>
       </w:r>
       <w:r>
         <w:rPr>
@@ -373,9 +381,9 @@
       <w:r>
         <w:rPr>
           <w:b/>
-          <w:color w:val="2E74B5"/>
-        </w:rPr>
-        <w:t xml:space="preserve">Varna (moderator) (Speaker 1)  </w:t>
+          <w:color w:val="B52E2E"/>
+        </w:rPr>
+        <w:t xml:space="preserve">Varna (Speaker 1)  </w:t>
       </w:r>
       <w:r>
         <w:rPr>
@@ -423,9 +431,9 @@
       <w:r>
         <w:rPr>
           <w:b/>
-          <w:color w:val="2E74B5"/>
-        </w:rPr>
-        <w:t xml:space="preserve">Varna (moderator) (Speaker 1)  </w:t>
+          <w:color w:val="B52E2E"/>
+        </w:rPr>
+        <w:t xml:space="preserve">Varna (Speaker 1)  </w:t>
       </w:r>
       <w:r>
         <w:rPr>
@@ -498,9 +506,9 @@
       <w:r>
         <w:rPr>
           <w:b/>
-          <w:color w:val="2E74B5"/>
-        </w:rPr>
-        <w:t xml:space="preserve">Varna (moderator) (Speaker 1)  </w:t>
+          <w:color w:val="B52E2E"/>
+        </w:rPr>
+        <w:t xml:space="preserve">Varna (Speaker 1)  </w:t>
       </w:r>
       <w:r>
         <w:rPr>
@@ -548,9 +556,9 @@
       <w:r>
         <w:rPr>
           <w:b/>
-          <w:color w:val="2E74B5"/>
-        </w:rPr>
-        <w:t xml:space="preserve">Varna (moderator) (Speaker 1)  </w:t>
+          <w:color w:val="B52E2E"/>
+        </w:rPr>
+        <w:t xml:space="preserve">Varna (Speaker 1)  </w:t>
       </w:r>
       <w:r>
         <w:rPr>
@@ -598,9 +606,9 @@
       <w:r>
         <w:rPr>
           <w:b/>
-          <w:color w:val="2E74B5"/>
-        </w:rPr>
-        <w:t xml:space="preserve">Varna (moderator) (Speaker 1)  </w:t>
+          <w:color w:val="B52E2E"/>
+        </w:rPr>
+        <w:t xml:space="preserve">Varna (Speaker 1)  </w:t>
       </w:r>
       <w:r>
         <w:rPr>
@@ -648,9 +656,9 @@
       <w:r>
         <w:rPr>
           <w:b/>
-          <w:color w:val="2E74B5"/>
-        </w:rPr>
-        <w:t xml:space="preserve">Varna (moderator) (Speaker 1)  </w:t>
+          <w:color w:val="B52E2E"/>
+        </w:rPr>
+        <w:t xml:space="preserve">Varna (Speaker 1)  </w:t>
       </w:r>
       <w:r>
         <w:rPr>
@@ -723,9 +731,9 @@
       <w:r>
         <w:rPr>
           <w:b/>
-          <w:color w:val="2E74B5"/>
-        </w:rPr>
-        <w:t xml:space="preserve">Varna (moderator) (Speaker 1)  </w:t>
+          <w:color w:val="B52E2E"/>
+        </w:rPr>
+        <w:t xml:space="preserve">Varna (Speaker 1)  </w:t>
       </w:r>
       <w:r>
         <w:rPr>
@@ -773,9 +781,9 @@
       <w:r>
         <w:rPr>
           <w:b/>
-          <w:color w:val="2E74B5"/>
-        </w:rPr>
-        <w:t xml:space="preserve">Varna (moderator) (Speaker 1)  </w:t>
+          <w:color w:val="B52E2E"/>
+        </w:rPr>
+        <w:t xml:space="preserve">Varna (Speaker 1)  </w:t>
       </w:r>
       <w:r>
         <w:rPr>
@@ -898,9 +906,9 @@
       <w:r>
         <w:rPr>
           <w:b/>
-          <w:color w:val="2E74B5"/>
-        </w:rPr>
-        <w:t xml:space="preserve">Varna (moderator) (Speaker 1)  </w:t>
+          <w:color w:val="B52E2E"/>
+        </w:rPr>
+        <w:t xml:space="preserve">Varna (Speaker 1)  </w:t>
       </w:r>
       <w:r>
         <w:rPr>
@@ -973,9 +981,9 @@
       <w:r>
         <w:rPr>
           <w:b/>
-          <w:color w:val="2E74B5"/>
-        </w:rPr>
-        <w:t xml:space="preserve">Varna (moderator) (Speaker 1)  </w:t>
+          <w:color w:val="B52E2E"/>
+        </w:rPr>
+        <w:t xml:space="preserve">Varna (Speaker 1)  </w:t>
       </w:r>
       <w:r>
         <w:rPr>
@@ -1073,9 +1081,9 @@
       <w:r>
         <w:rPr>
           <w:b/>
-          <w:color w:val="2E74B5"/>
-        </w:rPr>
-        <w:t xml:space="preserve">Varna (moderator) (Speaker 1)  </w:t>
+          <w:color w:val="B52E2E"/>
+        </w:rPr>
+        <w:t xml:space="preserve">Varna (Speaker 1)  </w:t>
       </w:r>
       <w:r>
         <w:rPr>
@@ -1123,9 +1131,9 @@
       <w:r>
         <w:rPr>
           <w:b/>
-          <w:color w:val="2E74B5"/>
-        </w:rPr>
-        <w:t xml:space="preserve">Varna (moderator) (Speaker 1)  </w:t>
+          <w:color w:val="B52E2E"/>
+        </w:rPr>
+        <w:t xml:space="preserve">Varna (Speaker 1)  </w:t>
       </w:r>
       <w:r>
         <w:rPr>
@@ -1273,9 +1281,9 @@
       <w:r>
         <w:rPr>
           <w:b/>
-          <w:color w:val="2E74B5"/>
-        </w:rPr>
-        <w:t xml:space="preserve">Varna (moderator) (Speaker 1)  </w:t>
+          <w:color w:val="B52E2E"/>
+        </w:rPr>
+        <w:t xml:space="preserve">Varna (Speaker 1)  </w:t>
       </w:r>
       <w:r>
         <w:rPr>
@@ -1323,9 +1331,9 @@
       <w:r>
         <w:rPr>
           <w:b/>
-          <w:color w:val="2E74B5"/>
-        </w:rPr>
-        <w:t xml:space="preserve">Varna (moderator) (Speaker 1)  </w:t>
+          <w:color w:val="B52E2E"/>
+        </w:rPr>
+        <w:t xml:space="preserve">Varna (Speaker 1)  </w:t>
       </w:r>
       <w:r>
         <w:rPr>
@@ -1373,9 +1381,9 @@
       <w:r>
         <w:rPr>
           <w:b/>
-          <w:color w:val="2E74B5"/>
-        </w:rPr>
-        <w:t xml:space="preserve">Varna (moderator) (Speaker 1)  </w:t>
+          <w:color w:val="B52E2E"/>
+        </w:rPr>
+        <w:t xml:space="preserve">Varna (Speaker 1)  </w:t>
       </w:r>
       <w:r>
         <w:rPr>
@@ -1423,9 +1431,9 @@
       <w:r>
         <w:rPr>
           <w:b/>
-          <w:color w:val="2E74B5"/>
-        </w:rPr>
-        <w:t xml:space="preserve">Varna (moderator) (Speaker 1)  </w:t>
+          <w:color w:val="B52E2E"/>
+        </w:rPr>
+        <w:t xml:space="preserve">Varna (Speaker 1)  </w:t>
       </w:r>
       <w:r>
         <w:rPr>
@@ -1473,9 +1481,9 @@
       <w:r>
         <w:rPr>
           <w:b/>
-          <w:color w:val="2E74B5"/>
-        </w:rPr>
-        <w:t xml:space="preserve">Varna (moderator) (Speaker 1)  </w:t>
+          <w:color w:val="B52E2E"/>
+        </w:rPr>
+        <w:t xml:space="preserve">Varna (Speaker 1)  </w:t>
       </w:r>
       <w:r>
         <w:rPr>
@@ -1523,9 +1531,9 @@
       <w:r>
         <w:rPr>
           <w:b/>
-          <w:color w:val="2E74B5"/>
-        </w:rPr>
-        <w:t xml:space="preserve">Varna (moderator) (Speaker 1)  </w:t>
+          <w:color w:val="B52E2E"/>
+        </w:rPr>
+        <w:t xml:space="preserve">Varna (Speaker 1)  </w:t>
       </w:r>
       <w:r>
         <w:rPr>
@@ -1575,7 +1583,7 @@
           <w:b/>
           <w:color w:val="2E74B5"/>
         </w:rPr>
-        <w:t xml:space="preserve">Arun Nagar (Speaker 14)  </w:t>
+        <w:t xml:space="preserve">Speaker 14 (name unclear)  </w:t>
       </w:r>
       <w:r>
         <w:rPr>
@@ -1625,7 +1633,7 @@
           <w:b/>
           <w:color w:val="2E74B5"/>
         </w:rPr>
-        <w:t xml:space="preserve">Arun Nagar (Speaker 14)  </w:t>
+        <w:t xml:space="preserve">Speaker 14 (name unclear)  </w:t>
       </w:r>
       <w:r>
         <w:rPr>
@@ -1700,7 +1708,7 @@
           <w:b/>
           <w:color w:val="2E74B5"/>
         </w:rPr>
-        <w:t xml:space="preserve">Arun Nagar (Speaker 14)  </w:t>
+        <w:t xml:space="preserve">Speaker 14 (name unclear)  </w:t>
       </w:r>
       <w:r>
         <w:rPr>
@@ -1823,9 +1831,9 @@
       <w:r>
         <w:rPr>
           <w:b/>
-          <w:color w:val="2E74B5"/>
-        </w:rPr>
-        <w:t xml:space="preserve">Varna (moderator) (Speaker 1)  </w:t>
+          <w:color w:val="B52E2E"/>
+        </w:rPr>
+        <w:t xml:space="preserve">Varna (Speaker 1)  </w:t>
       </w:r>
       <w:r>
         <w:rPr>
@@ -1898,9 +1906,9 @@
       <w:r>
         <w:rPr>
           <w:b/>
-          <w:color w:val="2E74B5"/>
-        </w:rPr>
-        <w:t xml:space="preserve">Varna (moderator) (Speaker 1)  </w:t>
+          <w:color w:val="B52E2E"/>
+        </w:rPr>
+        <w:t xml:space="preserve">Varna (Speaker 1)  </w:t>
       </w:r>
       <w:r>
         <w:rPr>
@@ -1948,9 +1956,9 @@
       <w:r>
         <w:rPr>
           <w:b/>
-          <w:color w:val="2E74B5"/>
-        </w:rPr>
-        <w:t xml:space="preserve">Varna (moderator) (Speaker 1)  </w:t>
+          <w:color w:val="B52E2E"/>
+        </w:rPr>
+        <w:t xml:space="preserve">Varna (Speaker 1)  </w:t>
       </w:r>
       <w:r>
         <w:rPr>
@@ -1998,9 +2006,9 @@
       <w:r>
         <w:rPr>
           <w:b/>
-          <w:color w:val="2E74B5"/>
-        </w:rPr>
-        <w:t xml:space="preserve">Varna (moderator) (Speaker 1)  </w:t>
+          <w:color w:val="B52E2E"/>
+        </w:rPr>
+        <w:t xml:space="preserve">Varna (Speaker 1)  </w:t>
       </w:r>
       <w:r>
         <w:rPr>
@@ -2048,9 +2056,9 @@
       <w:r>
         <w:rPr>
           <w:b/>
-          <w:color w:val="2E74B5"/>
-        </w:rPr>
-        <w:t xml:space="preserve">Varna (moderator) (Speaker 1)  </w:t>
+          <w:color w:val="B52E2E"/>
+        </w:rPr>
+        <w:t xml:space="preserve">Varna (Speaker 1)  </w:t>
       </w:r>
       <w:r>
         <w:rPr>
@@ -2098,9 +2106,9 @@
       <w:r>
         <w:rPr>
           <w:b/>
-          <w:color w:val="2E74B5"/>
-        </w:rPr>
-        <w:t xml:space="preserve">Varna (moderator) (Speaker 1)  </w:t>
+          <w:color w:val="B52E2E"/>
+        </w:rPr>
+        <w:t xml:space="preserve">Varna (Speaker 1)  </w:t>
       </w:r>
       <w:r>
         <w:rPr>
@@ -2148,9 +2156,9 @@
       <w:r>
         <w:rPr>
           <w:b/>
-          <w:color w:val="2E74B5"/>
-        </w:rPr>
-        <w:t xml:space="preserve">Varna (moderator) (Speaker 1)  </w:t>
+          <w:color w:val="B52E2E"/>
+        </w:rPr>
+        <w:t xml:space="preserve">Varna (Speaker 1)  </w:t>
       </w:r>
       <w:r>
         <w:rPr>
@@ -2198,9 +2206,9 @@
       <w:r>
         <w:rPr>
           <w:b/>
-          <w:color w:val="2E74B5"/>
-        </w:rPr>
-        <w:t xml:space="preserve">Varna (moderator) (Speaker 1)  </w:t>
+          <w:color w:val="B52E2E"/>
+        </w:rPr>
+        <w:t xml:space="preserve">Varna (Speaker 1)  </w:t>
       </w:r>
       <w:r>
         <w:rPr>
@@ -2248,9 +2256,9 @@
       <w:r>
         <w:rPr>
           <w:b/>
-          <w:color w:val="2E74B5"/>
-        </w:rPr>
-        <w:t xml:space="preserve">Varna (moderator) (Speaker 1)  </w:t>
+          <w:color w:val="B52E2E"/>
+        </w:rPr>
+        <w:t xml:space="preserve">Varna (Speaker 1)  </w:t>
       </w:r>
       <w:r>
         <w:rPr>
@@ -2298,9 +2306,9 @@
       <w:r>
         <w:rPr>
           <w:b/>
-          <w:color w:val="2E74B5"/>
-        </w:rPr>
-        <w:t xml:space="preserve">Varna (moderator) (Speaker 1)  </w:t>
+          <w:color w:val="B52E2E"/>
+        </w:rPr>
+        <w:t xml:space="preserve">Varna (Speaker 1)  </w:t>
       </w:r>
       <w:r>
         <w:rPr>
@@ -2348,9 +2356,9 @@
       <w:r>
         <w:rPr>
           <w:b/>
-          <w:color w:val="2E74B5"/>
-        </w:rPr>
-        <w:t xml:space="preserve">Varna (moderator) (Speaker 1)  </w:t>
+          <w:color w:val="B52E2E"/>
+        </w:rPr>
+        <w:t xml:space="preserve">Varna (Speaker 1)  </w:t>
       </w:r>
       <w:r>
         <w:rPr>
@@ -2398,9 +2406,9 @@
       <w:r>
         <w:rPr>
           <w:b/>
-          <w:color w:val="2E74B5"/>
-        </w:rPr>
-        <w:t xml:space="preserve">Varna (moderator) (Speaker 1)  </w:t>
+          <w:color w:val="B52E2E"/>
+        </w:rPr>
+        <w:t xml:space="preserve">Varna (Speaker 1)  </w:t>
       </w:r>
       <w:r>
         <w:rPr>
@@ -2498,9 +2506,9 @@
       <w:r>
         <w:rPr>
           <w:b/>
-          <w:color w:val="2E74B5"/>
-        </w:rPr>
-        <w:t xml:space="preserve">Varna (moderator) (Speaker 1)  </w:t>
+          <w:color w:val="B52E2E"/>
+        </w:rPr>
+        <w:t xml:space="preserve">Varna (Speaker 1)  </w:t>
       </w:r>
       <w:r>
         <w:rPr>
@@ -2550,7 +2558,7 @@
           <w:b/>
           <w:color w:val="2E74B5"/>
         </w:rPr>
-        <w:t xml:space="preserve">Arun Nagar (Speaker 14)  </w:t>
+        <w:t xml:space="preserve">Speaker 14 (name unclear)  </w:t>
       </w:r>
       <w:r>
         <w:rPr>
@@ -2573,9 +2581,9 @@
       <w:r>
         <w:rPr>
           <w:b/>
-          <w:color w:val="2E74B5"/>
-        </w:rPr>
-        <w:t xml:space="preserve">Varna (moderator) (Speaker 1)  </w:t>
+          <w:color w:val="B52E2E"/>
+        </w:rPr>
+        <w:t xml:space="preserve">Varna (Speaker 1)  </w:t>
       </w:r>
       <w:r>
         <w:rPr>
@@ -2600,7 +2608,7 @@
           <w:b/>
           <w:color w:val="2E74B5"/>
         </w:rPr>
-        <w:t xml:space="preserve">Arun Nagar (Speaker 14)  </w:t>
+        <w:t xml:space="preserve">Speaker 14 (name unclear)  </w:t>
       </w:r>
       <w:r>
         <w:rPr>
@@ -2623,9 +2631,9 @@
       <w:r>
         <w:rPr>
           <w:b/>
-          <w:color w:val="2E74B5"/>
-        </w:rPr>
-        <w:t xml:space="preserve">Varna (moderator) (Speaker 1)  </w:t>
+          <w:color w:val="B52E2E"/>
+        </w:rPr>
+        <w:t xml:space="preserve">Varna (Speaker 1)  </w:t>
       </w:r>
       <w:r>
         <w:rPr>
@@ -2650,7 +2658,7 @@
           <w:b/>
           <w:color w:val="2E74B5"/>
         </w:rPr>
-        <w:t xml:space="preserve">Arun Nagar (Speaker 14)  </w:t>
+        <w:t xml:space="preserve">Speaker 14 (name unclear)  </w:t>
       </w:r>
       <w:r>
         <w:rPr>
@@ -2673,9 +2681,9 @@
       <w:r>
         <w:rPr>
           <w:b/>
-          <w:color w:val="2E74B5"/>
-        </w:rPr>
-        <w:t xml:space="preserve">Varna (moderator) (Speaker 1)  </w:t>
+          <w:color w:val="B52E2E"/>
+        </w:rPr>
+        <w:t xml:space="preserve">Varna (Speaker 1)  </w:t>
       </w:r>
       <w:r>
         <w:rPr>
@@ -2700,7 +2708,7 @@
           <w:b/>
           <w:color w:val="2E74B5"/>
         </w:rPr>
-        <w:t xml:space="preserve">Arun Nagar (Speaker 14)  </w:t>
+        <w:t xml:space="preserve">Speaker 14 (name unclear)  </w:t>
       </w:r>
       <w:r>
         <w:rPr>
@@ -2723,9 +2731,9 @@
       <w:r>
         <w:rPr>
           <w:b/>
-          <w:color w:val="2E74B5"/>
-        </w:rPr>
-        <w:t xml:space="preserve">Varna (moderator) (Speaker 1)  </w:t>
+          <w:color w:val="B52E2E"/>
+        </w:rPr>
+        <w:t xml:space="preserve">Varna (Speaker 1)  </w:t>
       </w:r>
       <w:r>
         <w:rPr>
@@ -2750,7 +2758,7 @@
           <w:b/>
           <w:color w:val="2E74B5"/>
         </w:rPr>
-        <w:t xml:space="preserve">Arun Nagar (Speaker 14)  </w:t>
+        <w:t xml:space="preserve">Speaker 14 (name unclear)  </w:t>
       </w:r>
       <w:r>
         <w:rPr>
@@ -2773,9 +2781,9 @@
       <w:r>
         <w:rPr>
           <w:b/>
-          <w:color w:val="2E74B5"/>
-        </w:rPr>
-        <w:t xml:space="preserve">Varna (moderator) (Speaker 1)  </w:t>
+          <w:color w:val="B52E2E"/>
+        </w:rPr>
+        <w:t xml:space="preserve">Varna (Speaker 1)  </w:t>
       </w:r>
       <w:r>
         <w:rPr>
@@ -2848,9 +2856,9 @@
       <w:r>
         <w:rPr>
           <w:b/>
-          <w:color w:val="2E74B5"/>
-        </w:rPr>
-        <w:t xml:space="preserve">Varna (moderator) (Speaker 1)  </w:t>
+          <w:color w:val="B52E2E"/>
+        </w:rPr>
+        <w:t xml:space="preserve">Varna (Speaker 1)  </w:t>
       </w:r>
       <w:r>
         <w:rPr>
@@ -2898,9 +2906,9 @@
       <w:r>
         <w:rPr>
           <w:b/>
-          <w:color w:val="2E74B5"/>
-        </w:rPr>
-        <w:t xml:space="preserve">Varna (moderator) (Speaker 1)  </w:t>
+          <w:color w:val="B52E2E"/>
+        </w:rPr>
+        <w:t xml:space="preserve">Varna (Speaker 1)  </w:t>
       </w:r>
       <w:r>
         <w:rPr>
@@ -2998,9 +3006,9 @@
       <w:r>
         <w:rPr>
           <w:b/>
-          <w:color w:val="2E74B5"/>
-        </w:rPr>
-        <w:t xml:space="preserve">Varna (moderator) (Speaker 1)  </w:t>
+          <w:color w:val="B52E2E"/>
+        </w:rPr>
+        <w:t xml:space="preserve">Varna (Speaker 1)  </w:t>
       </w:r>
       <w:r>
         <w:rPr>
@@ -3048,9 +3056,9 @@
       <w:r>
         <w:rPr>
           <w:b/>
-          <w:color w:val="2E74B5"/>
-        </w:rPr>
-        <w:t xml:space="preserve">Varna (moderator) (Speaker 1)  </w:t>
+          <w:color w:val="B52E2E"/>
+        </w:rPr>
+        <w:t xml:space="preserve">Varna (Speaker 1)  </w:t>
       </w:r>
       <w:r>
         <w:rPr>
@@ -3123,9 +3131,9 @@
       <w:r>
         <w:rPr>
           <w:b/>
-          <w:color w:val="2E74B5"/>
-        </w:rPr>
-        <w:t xml:space="preserve">Varna (moderator) (Speaker 1)  </w:t>
+          <w:color w:val="B52E2E"/>
+        </w:rPr>
+        <w:t xml:space="preserve">Varna (Speaker 1)  </w:t>
       </w:r>
       <w:r>
         <w:rPr>
@@ -3248,9 +3256,9 @@
       <w:r>
         <w:rPr>
           <w:b/>
-          <w:color w:val="2E74B5"/>
-        </w:rPr>
-        <w:t xml:space="preserve">Varna (moderator) (Speaker 1)  </w:t>
+          <w:color w:val="B52E2E"/>
+        </w:rPr>
+        <w:t xml:space="preserve">Varna (Speaker 1)  </w:t>
       </w:r>
       <w:r>
         <w:rPr>
@@ -3298,9 +3306,9 @@
       <w:r>
         <w:rPr>
           <w:b/>
-          <w:color w:val="2E74B5"/>
-        </w:rPr>
-        <w:t xml:space="preserve">Varna (moderator) (Speaker 1)  </w:t>
+          <w:color w:val="B52E2E"/>
+        </w:rPr>
+        <w:t xml:space="preserve">Varna (Speaker 1)  </w:t>
       </w:r>
       <w:r>
         <w:rPr>
@@ -3398,9 +3406,9 @@
       <w:r>
         <w:rPr>
           <w:b/>
-          <w:color w:val="2E74B5"/>
-        </w:rPr>
-        <w:t xml:space="preserve">Varna (moderator) (Speaker 1)  </w:t>
+          <w:color w:val="B52E2E"/>
+        </w:rPr>
+        <w:t xml:space="preserve">Varna (Speaker 1)  </w:t>
       </w:r>
       <w:r>
         <w:rPr>
@@ -3548,9 +3556,9 @@
       <w:r>
         <w:rPr>
           <w:b/>
-          <w:color w:val="2E74B5"/>
-        </w:rPr>
-        <w:t xml:space="preserve">Varna (moderator) (Speaker 1)  </w:t>
+          <w:color w:val="B52E2E"/>
+        </w:rPr>
+        <w:t xml:space="preserve">Varna (Speaker 1)  </w:t>
       </w:r>
       <w:r>
         <w:rPr>
@@ -3598,9 +3606,9 @@
       <w:r>
         <w:rPr>
           <w:b/>
-          <w:color w:val="2E74B5"/>
-        </w:rPr>
-        <w:t xml:space="preserve">Varna (moderator) (Speaker 1)  </w:t>
+          <w:color w:val="B52E2E"/>
+        </w:rPr>
+        <w:t xml:space="preserve">Varna (Speaker 1)  </w:t>
       </w:r>
       <w:r>
         <w:rPr>
@@ -3648,9 +3656,9 @@
       <w:r>
         <w:rPr>
           <w:b/>
-          <w:color w:val="2E74B5"/>
-        </w:rPr>
-        <w:t xml:space="preserve">Varna (moderator) (Speaker 1)  </w:t>
+          <w:color w:val="B52E2E"/>
+        </w:rPr>
+        <w:t xml:space="preserve">Varna (Speaker 1)  </w:t>
       </w:r>
       <w:r>
         <w:rPr>
@@ -3698,9 +3706,9 @@
       <w:r>
         <w:rPr>
           <w:b/>
-          <w:color w:val="2E74B5"/>
-        </w:rPr>
-        <w:t xml:space="preserve">Varna (moderator) (Speaker 1)  </w:t>
+          <w:color w:val="B52E2E"/>
+        </w:rPr>
+        <w:t xml:space="preserve">Varna (Speaker 1)  </w:t>
       </w:r>
       <w:r>
         <w:rPr>
@@ -3748,9 +3756,9 @@
       <w:r>
         <w:rPr>
           <w:b/>
-          <w:color w:val="2E74B5"/>
-        </w:rPr>
-        <w:t xml:space="preserve">Varna (moderator) (Speaker 1)  </w:t>
+          <w:color w:val="B52E2E"/>
+        </w:rPr>
+        <w:t xml:space="preserve">Varna (Speaker 1)  </w:t>
       </w:r>
       <w:r>
         <w:rPr>
@@ -3798,9 +3806,9 @@
       <w:r>
         <w:rPr>
           <w:b/>
-          <w:color w:val="2E74B5"/>
-        </w:rPr>
-        <w:t xml:space="preserve">Varna (moderator) (Speaker 1)  </w:t>
+          <w:color w:val="B52E2E"/>
+        </w:rPr>
+        <w:t xml:space="preserve">Varna (Speaker 1)  </w:t>
       </w:r>
       <w:r>
         <w:rPr>
@@ -3848,9 +3856,9 @@
       <w:r>
         <w:rPr>
           <w:b/>
-          <w:color w:val="2E74B5"/>
-        </w:rPr>
-        <w:t xml:space="preserve">Varna (moderator) (Speaker 1)  </w:t>
+          <w:color w:val="B52E2E"/>
+        </w:rPr>
+        <w:t xml:space="preserve">Varna (Speaker 1)  </w:t>
       </w:r>
       <w:r>
         <w:rPr>
@@ -3898,9 +3906,9 @@
       <w:r>
         <w:rPr>
           <w:b/>
-          <w:color w:val="2E74B5"/>
-        </w:rPr>
-        <w:t xml:space="preserve">Varna (moderator) (Speaker 1)  </w:t>
+          <w:color w:val="B52E2E"/>
+        </w:rPr>
+        <w:t xml:space="preserve">Varna (Speaker 1)  </w:t>
       </w:r>
       <w:r>
         <w:rPr>
@@ -3948,9 +3956,9 @@
       <w:r>
         <w:rPr>
           <w:b/>
-          <w:color w:val="2E74B5"/>
-        </w:rPr>
-        <w:t xml:space="preserve">Varna (moderator) (Speaker 1)  </w:t>
+          <w:color w:val="B52E2E"/>
+        </w:rPr>
+        <w:t xml:space="preserve">Varna (Speaker 1)  </w:t>
       </w:r>
       <w:r>
         <w:rPr>
@@ -3998,9 +4006,9 @@
       <w:r>
         <w:rPr>
           <w:b/>
-          <w:color w:val="2E74B5"/>
-        </w:rPr>
-        <w:t xml:space="preserve">Varna (moderator) (Speaker 1)  </w:t>
+          <w:color w:val="B52E2E"/>
+        </w:rPr>
+        <w:t xml:space="preserve">Varna (Speaker 1)  </w:t>
       </w:r>
       <w:r>
         <w:rPr>
@@ -4123,9 +4131,9 @@
       <w:r>
         <w:rPr>
           <w:b/>
-          <w:color w:val="2E74B5"/>
-        </w:rPr>
-        <w:t xml:space="preserve">Varna (moderator) (Speaker 1)  </w:t>
+          <w:color w:val="B52E2E"/>
+        </w:rPr>
+        <w:t xml:space="preserve">Varna (Speaker 1)  </w:t>
       </w:r>
       <w:r>
         <w:rPr>
@@ -4173,9 +4181,9 @@
       <w:r>
         <w:rPr>
           <w:b/>
-          <w:color w:val="2E74B5"/>
-        </w:rPr>
-        <w:t xml:space="preserve">Varna (moderator) (Speaker 1)  </w:t>
+          <w:color w:val="B52E2E"/>
+        </w:rPr>
+        <w:t xml:space="preserve">Varna (Speaker 1)  </w:t>
       </w:r>
       <w:r>
         <w:rPr>
@@ -4273,9 +4281,9 @@
       <w:r>
         <w:rPr>
           <w:b/>
-          <w:color w:val="2E74B5"/>
-        </w:rPr>
-        <w:t xml:space="preserve">Varna (moderator) (Speaker 1)  </w:t>
+          <w:color w:val="B52E2E"/>
+        </w:rPr>
+        <w:t xml:space="preserve">Varna (Speaker 1)  </w:t>
       </w:r>
       <w:r>
         <w:rPr>
@@ -4323,9 +4331,9 @@
       <w:r>
         <w:rPr>
           <w:b/>
-          <w:color w:val="2E74B5"/>
-        </w:rPr>
-        <w:t xml:space="preserve">Varna (moderator) (Speaker 1)  </w:t>
+          <w:color w:val="B52E2E"/>
+        </w:rPr>
+        <w:t xml:space="preserve">Varna (Speaker 1)  </w:t>
       </w:r>
       <w:r>
         <w:rPr>
@@ -4373,9 +4381,9 @@
       <w:r>
         <w:rPr>
           <w:b/>
-          <w:color w:val="2E74B5"/>
-        </w:rPr>
-        <w:t xml:space="preserve">Varna (moderator) (Speaker 1)  </w:t>
+          <w:color w:val="B52E2E"/>
+        </w:rPr>
+        <w:t xml:space="preserve">Varna (Speaker 1)  </w:t>
       </w:r>
       <w:r>
         <w:rPr>
@@ -4423,9 +4431,9 @@
       <w:r>
         <w:rPr>
           <w:b/>
-          <w:color w:val="2E74B5"/>
-        </w:rPr>
-        <w:t xml:space="preserve">Varna (moderator) (Speaker 1)  </w:t>
+          <w:color w:val="B52E2E"/>
+        </w:rPr>
+        <w:t xml:space="preserve">Varna (Speaker 1)  </w:t>
       </w:r>
       <w:r>
         <w:rPr>
@@ -4473,9 +4481,9 @@
       <w:r>
         <w:rPr>
           <w:b/>
-          <w:color w:val="2E74B5"/>
-        </w:rPr>
-        <w:t xml:space="preserve">Varna (moderator) (Speaker 1)  </w:t>
+          <w:color w:val="B52E2E"/>
+        </w:rPr>
+        <w:t xml:space="preserve">Varna (Speaker 1)  </w:t>
       </w:r>
       <w:r>
         <w:rPr>
@@ -4523,9 +4531,9 @@
       <w:r>
         <w:rPr>
           <w:b/>
-          <w:color w:val="2E74B5"/>
-        </w:rPr>
-        <w:t xml:space="preserve">Varna (moderator) (Speaker 1)  </w:t>
+          <w:color w:val="B52E2E"/>
+        </w:rPr>
+        <w:t xml:space="preserve">Varna (Speaker 1)  </w:t>
       </w:r>
       <w:r>
         <w:rPr>
@@ -4573,9 +4581,9 @@
       <w:r>
         <w:rPr>
           <w:b/>
-          <w:color w:val="2E74B5"/>
-        </w:rPr>
-        <w:t xml:space="preserve">Varna (moderator) (Speaker 1)  </w:t>
+          <w:color w:val="B52E2E"/>
+        </w:rPr>
+        <w:t xml:space="preserve">Varna (Speaker 1)  </w:t>
       </w:r>
       <w:r>
         <w:rPr>
@@ -4648,9 +4656,9 @@
       <w:r>
         <w:rPr>
           <w:b/>
-          <w:color w:val="2E74B5"/>
-        </w:rPr>
-        <w:t xml:space="preserve">Varna (moderator) (Speaker 1)  </w:t>
+          <w:color w:val="B52E2E"/>
+        </w:rPr>
+        <w:t xml:space="preserve">Varna (Speaker 1)  </w:t>
       </w:r>
       <w:r>
         <w:rPr>
@@ -4698,9 +4706,9 @@
       <w:r>
         <w:rPr>
           <w:b/>
-          <w:color w:val="2E74B5"/>
-        </w:rPr>
-        <w:t xml:space="preserve">Speaker 17  </w:t>
+          <w:color w:val="B52E2E"/>
+        </w:rPr>
+        <w:t xml:space="preserve">Yuvraj (Speaker 17)  </w:t>
       </w:r>
       <w:r>
         <w:rPr>
@@ -4748,9 +4756,9 @@
       <w:r>
         <w:rPr>
           <w:b/>
-          <w:color w:val="2E74B5"/>
-        </w:rPr>
-        <w:t xml:space="preserve">Varna (moderator) (Speaker 1)  </w:t>
+          <w:color w:val="B52E2E"/>
+        </w:rPr>
+        <w:t xml:space="preserve">Varna (Speaker 1)  </w:t>
       </w:r>
       <w:r>
         <w:rPr>
@@ -4773,9 +4781,9 @@
       <w:r>
         <w:rPr>
           <w:b/>
-          <w:color w:val="2E74B5"/>
-        </w:rPr>
-        <w:t xml:space="preserve">Speaker 17  </w:t>
+          <w:color w:val="B52E2E"/>
+        </w:rPr>
+        <w:t xml:space="preserve">Yuvraj (Speaker 17)  </w:t>
       </w:r>
       <w:r>
         <w:rPr>
@@ -4823,9 +4831,9 @@
       <w:r>
         <w:rPr>
           <w:b/>
-          <w:color w:val="2E74B5"/>
-        </w:rPr>
-        <w:t xml:space="preserve">Varna (moderator) (Speaker 1)  </w:t>
+          <w:color w:val="B52E2E"/>
+        </w:rPr>
+        <w:t xml:space="preserve">Varna (Speaker 1)  </w:t>
       </w:r>
       <w:r>
         <w:rPr>
@@ -4873,9 +4881,9 @@
       <w:r>
         <w:rPr>
           <w:b/>
-          <w:color w:val="2E74B5"/>
-        </w:rPr>
-        <w:t xml:space="preserve">Varna (moderator) (Speaker 1)  </w:t>
+          <w:color w:val="B52E2E"/>
+        </w:rPr>
+        <w:t xml:space="preserve">Varna (Speaker 1)  </w:t>
       </w:r>
       <w:r>
         <w:rPr>
@@ -5048,9 +5056,9 @@
       <w:r>
         <w:rPr>
           <w:b/>
-          <w:color w:val="2E74B5"/>
-        </w:rPr>
-        <w:t xml:space="preserve">Varna (moderator) (Speaker 1)  </w:t>
+          <w:color w:val="B52E2E"/>
+        </w:rPr>
+        <w:t xml:space="preserve">Varna (Speaker 1)  </w:t>
       </w:r>
       <w:r>
         <w:rPr>
@@ -5148,9 +5156,9 @@
       <w:r>
         <w:rPr>
           <w:b/>
-          <w:color w:val="2E74B5"/>
-        </w:rPr>
-        <w:t xml:space="preserve">Varna (moderator) (Speaker 1)  </w:t>
+          <w:color w:val="B52E2E"/>
+        </w:rPr>
+        <w:t xml:space="preserve">Varna (Speaker 1)  </w:t>
       </w:r>
       <w:r>
         <w:rPr>
@@ -5198,9 +5206,9 @@
       <w:r>
         <w:rPr>
           <w:b/>
-          <w:color w:val="2E74B5"/>
-        </w:rPr>
-        <w:t xml:space="preserve">Varna (moderator) (Speaker 1)  </w:t>
+          <w:color w:val="B52E2E"/>
+        </w:rPr>
+        <w:t xml:space="preserve">Varna (Speaker 1)  </w:t>
       </w:r>
       <w:r>
         <w:rPr>
@@ -5273,9 +5281,9 @@
       <w:r>
         <w:rPr>
           <w:b/>
-          <w:color w:val="2E74B5"/>
-        </w:rPr>
-        <w:t xml:space="preserve">Varna (moderator) (Speaker 1)  </w:t>
+          <w:color w:val="B52E2E"/>
+        </w:rPr>
+        <w:t xml:space="preserve">Varna (Speaker 1)  </w:t>
       </w:r>
       <w:r>
         <w:rPr>
@@ -5623,9 +5631,9 @@
       <w:r>
         <w:rPr>
           <w:b/>
-          <w:color w:val="2E74B5"/>
-        </w:rPr>
-        <w:t xml:space="preserve">Varna (moderator) (Speaker 1)  </w:t>
+          <w:color w:val="B52E2E"/>
+        </w:rPr>
+        <w:t xml:space="preserve">Varna (Speaker 1)  </w:t>
       </w:r>
       <w:r>
         <w:rPr>
@@ -5673,9 +5681,9 @@
       <w:r>
         <w:rPr>
           <w:b/>
-          <w:color w:val="2E74B5"/>
-        </w:rPr>
-        <w:t xml:space="preserve">Varna (moderator) (Speaker 1)  </w:t>
+          <w:color w:val="B52E2E"/>
+        </w:rPr>
+        <w:t xml:space="preserve">Varna (Speaker 1)  </w:t>
       </w:r>
       <w:r>
         <w:rPr>
@@ -5723,9 +5731,9 @@
       <w:r>
         <w:rPr>
           <w:b/>
-          <w:color w:val="2E74B5"/>
-        </w:rPr>
-        <w:t xml:space="preserve">Varna (moderator) (Speaker 1)  </w:t>
+          <w:color w:val="B52E2E"/>
+        </w:rPr>
+        <w:t xml:space="preserve">Varna (Speaker 1)  </w:t>
       </w:r>
       <w:r>
         <w:rPr>
@@ -5773,9 +5781,9 @@
       <w:r>
         <w:rPr>
           <w:b/>
-          <w:color w:val="2E74B5"/>
-        </w:rPr>
-        <w:t xml:space="preserve">Varna (moderator) (Speaker 1)  </w:t>
+          <w:color w:val="B52E2E"/>
+        </w:rPr>
+        <w:t xml:space="preserve">Varna (Speaker 1)  </w:t>
       </w:r>
       <w:r>
         <w:rPr>
@@ -5873,9 +5881,9 @@
       <w:r>
         <w:rPr>
           <w:b/>
-          <w:color w:val="2E74B5"/>
-        </w:rPr>
-        <w:t xml:space="preserve">Varna (moderator) (Speaker 1)  </w:t>
+          <w:color w:val="B52E2E"/>
+        </w:rPr>
+        <w:t xml:space="preserve">Varna (Speaker 1)  </w:t>
       </w:r>
       <w:r>
         <w:rPr>
@@ -5923,9 +5931,9 @@
       <w:r>
         <w:rPr>
           <w:b/>
-          <w:color w:val="2E74B5"/>
-        </w:rPr>
-        <w:t xml:space="preserve">Varna (moderator) (Speaker 1)  </w:t>
+          <w:color w:val="B52E2E"/>
+        </w:rPr>
+        <w:t xml:space="preserve">Varna (Speaker 1)  </w:t>
       </w:r>
       <w:r>
         <w:rPr>
@@ -5973,9 +5981,9 @@
       <w:r>
         <w:rPr>
           <w:b/>
-          <w:color w:val="2E74B5"/>
-        </w:rPr>
-        <w:t xml:space="preserve">Varna (moderator) (Speaker 1)  </w:t>
+          <w:color w:val="B52E2E"/>
+        </w:rPr>
+        <w:t xml:space="preserve">Varna (Speaker 1)  </w:t>
       </w:r>
       <w:r>
         <w:rPr>
@@ -6023,9 +6031,9 @@
       <w:r>
         <w:rPr>
           <w:b/>
-          <w:color w:val="2E74B5"/>
-        </w:rPr>
-        <w:t xml:space="preserve">Varna (moderator) (Speaker 1)  </w:t>
+          <w:color w:val="B52E2E"/>
+        </w:rPr>
+        <w:t xml:space="preserve">Varna (Speaker 1)  </w:t>
       </w:r>
       <w:r>
         <w:rPr>
@@ -6098,9 +6106,9 @@
       <w:r>
         <w:rPr>
           <w:b/>
-          <w:color w:val="2E74B5"/>
-        </w:rPr>
-        <w:t xml:space="preserve">Varna (moderator) (Speaker 1)  </w:t>
+          <w:color w:val="B52E2E"/>
+        </w:rPr>
+        <w:t xml:space="preserve">Varna (Speaker 1)  </w:t>
       </w:r>
       <w:r>
         <w:rPr>
@@ -6148,9 +6156,9 @@
       <w:r>
         <w:rPr>
           <w:b/>
-          <w:color w:val="2E74B5"/>
-        </w:rPr>
-        <w:t xml:space="preserve">Varna (moderator) (Speaker 1)  </w:t>
+          <w:color w:val="B52E2E"/>
+        </w:rPr>
+        <w:t xml:space="preserve">Varna (Speaker 1)  </w:t>
       </w:r>
       <w:r>
         <w:rPr>
@@ -6198,9 +6206,9 @@
       <w:r>
         <w:rPr>
           <w:b/>
-          <w:color w:val="2E74B5"/>
-        </w:rPr>
-        <w:t xml:space="preserve">Varna (moderator) (Speaker 1)  </w:t>
+          <w:color w:val="B52E2E"/>
+        </w:rPr>
+        <w:t xml:space="preserve">Varna (Speaker 1)  </w:t>
       </w:r>
       <w:r>
         <w:rPr>
@@ -6248,9 +6256,9 @@
       <w:r>
         <w:rPr>
           <w:b/>
-          <w:color w:val="2E74B5"/>
-        </w:rPr>
-        <w:t xml:space="preserve">Varna (moderator) (Speaker 1)  </w:t>
+          <w:color w:val="B52E2E"/>
+        </w:rPr>
+        <w:t xml:space="preserve">Varna (Speaker 1)  </w:t>
       </w:r>
       <w:r>
         <w:rPr>
@@ -6298,9 +6306,9 @@
       <w:r>
         <w:rPr>
           <w:b/>
-          <w:color w:val="2E74B5"/>
-        </w:rPr>
-        <w:t xml:space="preserve">Varna (moderator) (Speaker 1)  </w:t>
+          <w:color w:val="B52E2E"/>
+        </w:rPr>
+        <w:t xml:space="preserve">Varna (Speaker 1)  </w:t>
       </w:r>
       <w:r>
         <w:rPr>
@@ -6498,9 +6506,9 @@
       <w:r>
         <w:rPr>
           <w:b/>
-          <w:color w:val="2E74B5"/>
-        </w:rPr>
-        <w:t xml:space="preserve">Varna (moderator) (Speaker 1)  </w:t>
+          <w:color w:val="B52E2E"/>
+        </w:rPr>
+        <w:t xml:space="preserve">Varna (Speaker 1)  </w:t>
       </w:r>
       <w:r>
         <w:rPr>
@@ -6548,9 +6556,9 @@
       <w:r>
         <w:rPr>
           <w:b/>
-          <w:color w:val="2E74B5"/>
-        </w:rPr>
-        <w:t xml:space="preserve">Varna (moderator) (Speaker 1)  </w:t>
+          <w:color w:val="B52E2E"/>
+        </w:rPr>
+        <w:t xml:space="preserve">Varna (Speaker 1)  </w:t>
       </w:r>
       <w:r>
         <w:rPr>
@@ -6598,9 +6606,9 @@
       <w:r>
         <w:rPr>
           <w:b/>
-          <w:color w:val="2E74B5"/>
-        </w:rPr>
-        <w:t xml:space="preserve">Varna (moderator) (Speaker 1)  </w:t>
+          <w:color w:val="B52E2E"/>
+        </w:rPr>
+        <w:t xml:space="preserve">Varna (Speaker 1)  </w:t>
       </w:r>
       <w:r>
         <w:rPr>
@@ -6648,9 +6656,9 @@
       <w:r>
         <w:rPr>
           <w:b/>
-          <w:color w:val="2E74B5"/>
-        </w:rPr>
-        <w:t xml:space="preserve">Varna (moderator) (Speaker 1)  </w:t>
+          <w:color w:val="B52E2E"/>
+        </w:rPr>
+        <w:t xml:space="preserve">Varna (Speaker 1)  </w:t>
       </w:r>
       <w:r>
         <w:rPr>
@@ -6698,9 +6706,9 @@
       <w:r>
         <w:rPr>
           <w:b/>
-          <w:color w:val="2E74B5"/>
-        </w:rPr>
-        <w:t xml:space="preserve">Varna (moderator) (Speaker 1)  </w:t>
+          <w:color w:val="B52E2E"/>
+        </w:rPr>
+        <w:t xml:space="preserve">Varna (Speaker 1)  </w:t>
       </w:r>
       <w:r>
         <w:rPr>
@@ -6748,9 +6756,9 @@
       <w:r>
         <w:rPr>
           <w:b/>
-          <w:color w:val="2E74B5"/>
-        </w:rPr>
-        <w:t xml:space="preserve">Varna (moderator) (Speaker 1)  </w:t>
+          <w:color w:val="B52E2E"/>
+        </w:rPr>
+        <w:t xml:space="preserve">Varna (Speaker 1)  </w:t>
       </w:r>
       <w:r>
         <w:rPr>
@@ -6800,7 +6808,7 @@
           <w:b/>
           <w:color w:val="2E74B5"/>
         </w:rPr>
-        <w:t xml:space="preserve">Arun Nagar (Speaker 14)  </w:t>
+        <w:t xml:space="preserve">Speaker 14 (name unclear)  </w:t>
       </w:r>
       <w:r>
         <w:rPr>
@@ -6850,7 +6858,7 @@
           <w:b/>
           <w:color w:val="2E74B5"/>
         </w:rPr>
-        <w:t xml:space="preserve">Arun Nagar (Speaker 14)  </w:t>
+        <w:t xml:space="preserve">Speaker 14 (name unclear)  </w:t>
       </w:r>
       <w:r>
         <w:rPr>
@@ -6873,9 +6881,9 @@
       <w:r>
         <w:rPr>
           <w:b/>
-          <w:color w:val="2E74B5"/>
-        </w:rPr>
-        <w:t xml:space="preserve">Varna (moderator) (Speaker 1)  </w:t>
+          <w:color w:val="B52E2E"/>
+        </w:rPr>
+        <w:t xml:space="preserve">Varna (Speaker 1)  </w:t>
       </w:r>
       <w:r>
         <w:rPr>
@@ -6900,7 +6908,7 @@
           <w:b/>
           <w:color w:val="2E74B5"/>
         </w:rPr>
-        <w:t xml:space="preserve">Arun Nagar (Speaker 14)  </w:t>
+        <w:t xml:space="preserve">Speaker 14 (name unclear)  </w:t>
       </w:r>
       <w:r>
         <w:rPr>
@@ -6948,9 +6956,9 @@
       <w:r>
         <w:rPr>
           <w:b/>
-          <w:color w:val="2E74B5"/>
-        </w:rPr>
-        <w:t xml:space="preserve">Varna (moderator) (Speaker 1)  </w:t>
+          <w:color w:val="B52E2E"/>
+        </w:rPr>
+        <w:t xml:space="preserve">Varna (Speaker 1)  </w:t>
       </w:r>
       <w:r>
         <w:rPr>
@@ -6998,9 +7006,9 @@
       <w:r>
         <w:rPr>
           <w:b/>
-          <w:color w:val="2E74B5"/>
-        </w:rPr>
-        <w:t xml:space="preserve">Varna (moderator) (Speaker 1)  </w:t>
+          <w:color w:val="B52E2E"/>
+        </w:rPr>
+        <w:t xml:space="preserve">Varna (Speaker 1)  </w:t>
       </w:r>
       <w:r>
         <w:rPr>
@@ -7123,9 +7131,9 @@
       <w:r>
         <w:rPr>
           <w:b/>
-          <w:color w:val="2E74B5"/>
-        </w:rPr>
-        <w:t xml:space="preserve">Varna (moderator) (Speaker 1)  </w:t>
+          <w:color w:val="B52E2E"/>
+        </w:rPr>
+        <w:t xml:space="preserve">Varna (Speaker 1)  </w:t>
       </w:r>
       <w:r>
         <w:rPr>
@@ -7175,7 +7183,7 @@
           <w:b/>
           <w:color w:val="2E74B5"/>
         </w:rPr>
-        <w:t xml:space="preserve">Arun Nagar (Speaker 14)  </w:t>
+        <w:t xml:space="preserve">Speaker 14 (name unclear)  </w:t>
       </w:r>
       <w:r>
         <w:rPr>
@@ -7273,9 +7281,9 @@
       <w:r>
         <w:rPr>
           <w:b/>
-          <w:color w:val="2E74B5"/>
-        </w:rPr>
-        <w:t xml:space="preserve">Varna (moderator) (Speaker 1)  </w:t>
+          <w:color w:val="B52E2E"/>
+        </w:rPr>
+        <w:t xml:space="preserve">Varna (Speaker 1)  </w:t>
       </w:r>
       <w:r>
         <w:rPr>
@@ -7448,9 +7456,9 @@
       <w:r>
         <w:rPr>
           <w:b/>
-          <w:color w:val="2E74B5"/>
-        </w:rPr>
-        <w:t xml:space="preserve">Speaker 17  </w:t>
+          <w:color w:val="B52E2E"/>
+        </w:rPr>
+        <w:t xml:space="preserve">Yuvraj (Speaker 17)  </w:t>
       </w:r>
       <w:r>
         <w:rPr>
@@ -7548,9 +7556,9 @@
       <w:r>
         <w:rPr>
           <w:b/>
-          <w:color w:val="2E74B5"/>
-        </w:rPr>
-        <w:t xml:space="preserve">Varna (moderator) (Speaker 1)  </w:t>
+          <w:color w:val="B52E2E"/>
+        </w:rPr>
+        <w:t xml:space="preserve">Varna (Speaker 1)  </w:t>
       </w:r>
       <w:r>
         <w:rPr>
@@ -7623,9 +7631,9 @@
       <w:r>
         <w:rPr>
           <w:b/>
-          <w:color w:val="2E74B5"/>
-        </w:rPr>
-        <w:t xml:space="preserve">Varna (moderator) (Speaker 1)  </w:t>
+          <w:color w:val="B52E2E"/>
+        </w:rPr>
+        <w:t xml:space="preserve">Varna (Speaker 1)  </w:t>
       </w:r>
       <w:r>
         <w:rPr>
@@ -7673,9 +7681,9 @@
       <w:r>
         <w:rPr>
           <w:b/>
-          <w:color w:val="2E74B5"/>
-        </w:rPr>
-        <w:t xml:space="preserve">Varna (moderator) (Speaker 1)  </w:t>
+          <w:color w:val="B52E2E"/>
+        </w:rPr>
+        <w:t xml:space="preserve">Varna (Speaker 1)  </w:t>
       </w:r>
       <w:r>
         <w:rPr>
@@ -7723,9 +7731,9 @@
       <w:r>
         <w:rPr>
           <w:b/>
-          <w:color w:val="2E74B5"/>
-        </w:rPr>
-        <w:t xml:space="preserve">Varna (moderator) (Speaker 1)  </w:t>
+          <w:color w:val="B52E2E"/>
+        </w:rPr>
+        <w:t xml:space="preserve">Varna (Speaker 1)  </w:t>
       </w:r>
       <w:r>
         <w:rPr>
@@ -7773,9 +7781,9 @@
       <w:r>
         <w:rPr>
           <w:b/>
-          <w:color w:val="2E74B5"/>
-        </w:rPr>
-        <w:t xml:space="preserve">Varna (moderator) (Speaker 1)  </w:t>
+          <w:color w:val="B52E2E"/>
+        </w:rPr>
+        <w:t xml:space="preserve">Varna (Speaker 1)  </w:t>
       </w:r>
       <w:r>
         <w:rPr>
@@ -7823,9 +7831,9 @@
       <w:r>
         <w:rPr>
           <w:b/>
-          <w:color w:val="2E74B5"/>
-        </w:rPr>
-        <w:t xml:space="preserve">Varna (moderator) (Speaker 1)  </w:t>
+          <w:color w:val="B52E2E"/>
+        </w:rPr>
+        <w:t xml:space="preserve">Varna (Speaker 1)  </w:t>
       </w:r>
       <w:r>
         <w:rPr>
@@ -8173,9 +8181,9 @@
       <w:r>
         <w:rPr>
           <w:b/>
-          <w:color w:val="2E74B5"/>
-        </w:rPr>
-        <w:t xml:space="preserve">Varna (moderator) (Speaker 1)  </w:t>
+          <w:color w:val="B52E2E"/>
+        </w:rPr>
+        <w:t xml:space="preserve">Varna (Speaker 1)  </w:t>
       </w:r>
       <w:r>
         <w:rPr>
@@ -8223,9 +8231,9 @@
       <w:r>
         <w:rPr>
           <w:b/>
-          <w:color w:val="2E74B5"/>
-        </w:rPr>
-        <w:t xml:space="preserve">Varna (moderator) (Speaker 1)  </w:t>
+          <w:color w:val="B52E2E"/>
+        </w:rPr>
+        <w:t xml:space="preserve">Varna (Speaker 1)  </w:t>
       </w:r>
       <w:r>
         <w:rPr>
@@ -8298,9 +8306,9 @@
       <w:r>
         <w:rPr>
           <w:b/>
-          <w:color w:val="2E74B5"/>
-        </w:rPr>
-        <w:t xml:space="preserve">Varna (moderator) (Speaker 1)  </w:t>
+          <w:color w:val="B52E2E"/>
+        </w:rPr>
+        <w:t xml:space="preserve">Varna (Speaker 1)  </w:t>
       </w:r>
       <w:r>
         <w:rPr>
@@ -8348,9 +8356,9 @@
       <w:r>
         <w:rPr>
           <w:b/>
-          <w:color w:val="2E74B5"/>
-        </w:rPr>
-        <w:t xml:space="preserve">Varna (moderator) (Speaker 1)  </w:t>
+          <w:color w:val="B52E2E"/>
+        </w:rPr>
+        <w:t xml:space="preserve">Varna (Speaker 1)  </w:t>
       </w:r>
       <w:r>
         <w:rPr>
@@ -8398,9 +8406,9 @@
       <w:r>
         <w:rPr>
           <w:b/>
-          <w:color w:val="2E74B5"/>
-        </w:rPr>
-        <w:t xml:space="preserve">Speaker 17  </w:t>
+          <w:color w:val="B52E2E"/>
+        </w:rPr>
+        <w:t xml:space="preserve">Yuvraj (Speaker 17)  </w:t>
       </w:r>
       <w:r>
         <w:rPr>
@@ -8448,9 +8456,9 @@
       <w:r>
         <w:rPr>
           <w:b/>
-          <w:color w:val="2E74B5"/>
-        </w:rPr>
-        <w:t xml:space="preserve">Speaker 17  </w:t>
+          <w:color w:val="B52E2E"/>
+        </w:rPr>
+        <w:t xml:space="preserve">Yuvraj (Speaker 17)  </w:t>
       </w:r>
       <w:r>
         <w:rPr>
@@ -8473,9 +8481,9 @@
       <w:r>
         <w:rPr>
           <w:b/>
-          <w:color w:val="2E74B5"/>
-        </w:rPr>
-        <w:t xml:space="preserve">Varna (moderator) (Speaker 1)  </w:t>
+          <w:color w:val="B52E2E"/>
+        </w:rPr>
+        <w:t xml:space="preserve">Varna (Speaker 1)  </w:t>
       </w:r>
       <w:r>
         <w:rPr>
@@ -8523,9 +8531,9 @@
       <w:r>
         <w:rPr>
           <w:b/>
-          <w:color w:val="2E74B5"/>
-        </w:rPr>
-        <w:t xml:space="preserve">Speaker 17  </w:t>
+          <w:color w:val="B52E2E"/>
+        </w:rPr>
+        <w:t xml:space="preserve">Yuvraj (Speaker 17)  </w:t>
       </w:r>
       <w:r>
         <w:rPr>
@@ -8548,9 +8556,9 @@
       <w:r>
         <w:rPr>
           <w:b/>
-          <w:color w:val="2E74B5"/>
-        </w:rPr>
-        <w:t xml:space="preserve">Varna (moderator) (Speaker 1)  </w:t>
+          <w:color w:val="B52E2E"/>
+        </w:rPr>
+        <w:t xml:space="preserve">Varna (Speaker 1)  </w:t>
       </w:r>
       <w:r>
         <w:rPr>
@@ -8573,9 +8581,9 @@
       <w:r>
         <w:rPr>
           <w:b/>
-          <w:color w:val="2E74B5"/>
-        </w:rPr>
-        <w:t xml:space="preserve">Speaker 17  </w:t>
+          <w:color w:val="B52E2E"/>
+        </w:rPr>
+        <w:t xml:space="preserve">Yuvraj (Speaker 17)  </w:t>
       </w:r>
       <w:r>
         <w:rPr>
@@ -8623,9 +8631,9 @@
       <w:r>
         <w:rPr>
           <w:b/>
-          <w:color w:val="2E74B5"/>
-        </w:rPr>
-        <w:t xml:space="preserve">Speaker 17  </w:t>
+          <w:color w:val="B52E2E"/>
+        </w:rPr>
+        <w:t xml:space="preserve">Yuvraj (Speaker 17)  </w:t>
       </w:r>
       <w:r>
         <w:rPr>
@@ -8723,9 +8731,9 @@
       <w:r>
         <w:rPr>
           <w:b/>
-          <w:color w:val="2E74B5"/>
-        </w:rPr>
-        <w:t xml:space="preserve">Varna (moderator) (Speaker 1)  </w:t>
+          <w:color w:val="B52E2E"/>
+        </w:rPr>
+        <w:t xml:space="preserve">Varna (Speaker 1)  </w:t>
       </w:r>
       <w:r>
         <w:rPr>
@@ -8773,9 +8781,9 @@
       <w:r>
         <w:rPr>
           <w:b/>
-          <w:color w:val="2E74B5"/>
-        </w:rPr>
-        <w:t xml:space="preserve">Speaker 17  </w:t>
+          <w:color w:val="B52E2E"/>
+        </w:rPr>
+        <w:t xml:space="preserve">Yuvraj (Speaker 17)  </w:t>
       </w:r>
       <w:r>
         <w:rPr>
@@ -8923,9 +8931,9 @@
       <w:r>
         <w:rPr>
           <w:b/>
-          <w:color w:val="2E74B5"/>
-        </w:rPr>
-        <w:t xml:space="preserve">Varna (moderator) (Speaker 1)  </w:t>
+          <w:color w:val="B52E2E"/>
+        </w:rPr>
+        <w:t xml:space="preserve">Varna (Speaker 1)  </w:t>
       </w:r>
       <w:r>
         <w:rPr>
@@ -8973,9 +8981,9 @@
       <w:r>
         <w:rPr>
           <w:b/>
-          <w:color w:val="2E74B5"/>
-        </w:rPr>
-        <w:t xml:space="preserve">Varna (moderator) (Speaker 1)  </w:t>
+          <w:color w:val="B52E2E"/>
+        </w:rPr>
+        <w:t xml:space="preserve">Varna (Speaker 1)  </w:t>
       </w:r>
       <w:r>
         <w:rPr>
@@ -9048,9 +9056,9 @@
       <w:r>
         <w:rPr>
           <w:b/>
-          <w:color w:val="2E74B5"/>
-        </w:rPr>
-        <w:t xml:space="preserve">Varna (moderator) (Speaker 1)  </w:t>
+          <w:color w:val="B52E2E"/>
+        </w:rPr>
+        <w:t xml:space="preserve">Varna (Speaker 1)  </w:t>
       </w:r>
       <w:r>
         <w:rPr>
@@ -9073,9 +9081,9 @@
       <w:r>
         <w:rPr>
           <w:b/>
-          <w:color w:val="2E74B5"/>
-        </w:rPr>
-        <w:t xml:space="preserve">Speaker 17  </w:t>
+          <w:color w:val="B52E2E"/>
+        </w:rPr>
+        <w:t xml:space="preserve">Yuvraj (Speaker 17)  </w:t>
       </w:r>
       <w:r>
         <w:rPr>
@@ -9148,9 +9156,9 @@
       <w:r>
         <w:rPr>
           <w:b/>
-          <w:color w:val="2E74B5"/>
-        </w:rPr>
-        <w:t xml:space="preserve">Speaker 17  </w:t>
+          <w:color w:val="B52E2E"/>
+        </w:rPr>
+        <w:t xml:space="preserve">Yuvraj (Speaker 17)  </w:t>
       </w:r>
       <w:r>
         <w:rPr>
@@ -9198,9 +9206,9 @@
       <w:r>
         <w:rPr>
           <w:b/>
-          <w:color w:val="2E74B5"/>
-        </w:rPr>
-        <w:t xml:space="preserve">Speaker 17  </w:t>
+          <w:color w:val="B52E2E"/>
+        </w:rPr>
+        <w:t xml:space="preserve">Yuvraj (Speaker 17)  </w:t>
       </w:r>
       <w:r>
         <w:rPr>
@@ -9348,9 +9356,9 @@
       <w:r>
         <w:rPr>
           <w:b/>
-          <w:color w:val="2E74B5"/>
-        </w:rPr>
-        <w:t xml:space="preserve">Speaker 17  </w:t>
+          <w:color w:val="B52E2E"/>
+        </w:rPr>
+        <w:t xml:space="preserve">Yuvraj (Speaker 17)  </w:t>
       </w:r>
       <w:r>
         <w:rPr>
@@ -9448,9 +9456,9 @@
       <w:r>
         <w:rPr>
           <w:b/>
-          <w:color w:val="2E74B5"/>
-        </w:rPr>
-        <w:t xml:space="preserve">Speaker 17  </w:t>
+          <w:color w:val="B52E2E"/>
+        </w:rPr>
+        <w:t xml:space="preserve">Yuvraj (Speaker 17)  </w:t>
       </w:r>
       <w:r>
         <w:rPr>
@@ -9798,9 +9806,9 @@
       <w:r>
         <w:rPr>
           <w:b/>
-          <w:color w:val="2E74B5"/>
-        </w:rPr>
-        <w:t xml:space="preserve">Varna (moderator) (Speaker 1)  </w:t>
+          <w:color w:val="B52E2E"/>
+        </w:rPr>
+        <w:t xml:space="preserve">Varna (Speaker 1)  </w:t>
       </w:r>
       <w:r>
         <w:rPr>
@@ -9848,9 +9856,9 @@
       <w:r>
         <w:rPr>
           <w:b/>
-          <w:color w:val="2E74B5"/>
-        </w:rPr>
-        <w:t xml:space="preserve">Varna (moderator) (Speaker 1)  </w:t>
+          <w:color w:val="B52E2E"/>
+        </w:rPr>
+        <w:t xml:space="preserve">Varna (Speaker 1)  </w:t>
       </w:r>
       <w:r>
         <w:rPr>
@@ -9898,9 +9906,9 @@
       <w:r>
         <w:rPr>
           <w:b/>
-          <w:color w:val="2E74B5"/>
-        </w:rPr>
-        <w:t xml:space="preserve">Varna (moderator) (Speaker 1)  </w:t>
+          <w:color w:val="B52E2E"/>
+        </w:rPr>
+        <w:t xml:space="preserve">Varna (Speaker 1)  </w:t>
       </w:r>
       <w:r>
         <w:rPr>
@@ -10275,7 +10283,7 @@
           <w:b/>
           <w:color w:val="2E74B5"/>
         </w:rPr>
-        <w:t xml:space="preserve">Arun Nagar (Speaker 14)  </w:t>
+        <w:t xml:space="preserve">Speaker 14 (name unclear)  </w:t>
       </w:r>
       <w:r>
         <w:rPr>
@@ -10325,7 +10333,7 @@
           <w:b/>
           <w:color w:val="2E74B5"/>
         </w:rPr>
-        <w:t xml:space="preserve">Arun Nagar (Speaker 14)  </w:t>
+        <w:t xml:space="preserve">Speaker 14 (name unclear)  </w:t>
       </w:r>
       <w:r>
         <w:rPr>
@@ -10400,7 +10408,7 @@
           <w:b/>
           <w:color w:val="2E74B5"/>
         </w:rPr>
-        <w:t xml:space="preserve">Arun Nagar (Speaker 14)  </w:t>
+        <w:t xml:space="preserve">Speaker 14 (name unclear)  </w:t>
       </w:r>
       <w:r>
         <w:rPr>
@@ -10450,7 +10458,7 @@
           <w:b/>
           <w:color w:val="2E74B5"/>
         </w:rPr>
-        <w:t xml:space="preserve">Arun Nagar (Speaker 14)  </w:t>
+        <w:t xml:space="preserve">Speaker 14 (name unclear)  </w:t>
       </w:r>
       <w:r>
         <w:rPr>
@@ -10500,7 +10508,7 @@
           <w:b/>
           <w:color w:val="2E74B5"/>
         </w:rPr>
-        <w:t xml:space="preserve">Arun Nagar (Speaker 14)  </w:t>
+        <w:t xml:space="preserve">Speaker 14 (name unclear)  </w:t>
       </w:r>
       <w:r>
         <w:rPr>
@@ -10573,9 +10581,9 @@
       <w:r>
         <w:rPr>
           <w:b/>
-          <w:color w:val="2E74B5"/>
-        </w:rPr>
-        <w:t xml:space="preserve">Varna (moderator) (Speaker 1)  </w:t>
+          <w:color w:val="B52E2E"/>
+        </w:rPr>
+        <w:t xml:space="preserve">Varna (Speaker 1)  </w:t>
       </w:r>
       <w:r>
         <w:rPr>
@@ -10648,9 +10656,9 @@
       <w:r>
         <w:rPr>
           <w:b/>
-          <w:color w:val="2E74B5"/>
-        </w:rPr>
-        <w:t xml:space="preserve">Varna (moderator) (Speaker 1)  </w:t>
+          <w:color w:val="B52E2E"/>
+        </w:rPr>
+        <w:t xml:space="preserve">Varna (Speaker 1)  </w:t>
       </w:r>
       <w:r>
         <w:rPr>
@@ -10723,9 +10731,9 @@
       <w:r>
         <w:rPr>
           <w:b/>
-          <w:color w:val="2E74B5"/>
-        </w:rPr>
-        <w:t xml:space="preserve">Varna (moderator) (Speaker 1)  </w:t>
+          <w:color w:val="B52E2E"/>
+        </w:rPr>
+        <w:t xml:space="preserve">Varna (Speaker 1)  </w:t>
       </w:r>
       <w:r>
         <w:rPr>
@@ -10773,9 +10781,9 @@
       <w:r>
         <w:rPr>
           <w:b/>
-          <w:color w:val="2E74B5"/>
-        </w:rPr>
-        <w:t xml:space="preserve">Varna (moderator) (Speaker 1)  </w:t>
+          <w:color w:val="B52E2E"/>
+        </w:rPr>
+        <w:t xml:space="preserve">Varna (Speaker 1)  </w:t>
       </w:r>
       <w:r>
         <w:rPr>
@@ -10973,9 +10981,9 @@
       <w:r>
         <w:rPr>
           <w:b/>
-          <w:color w:val="2E74B5"/>
-        </w:rPr>
-        <w:t xml:space="preserve">Varna (moderator) (Speaker 1)  </w:t>
+          <w:color w:val="B52E2E"/>
+        </w:rPr>
+        <w:t xml:space="preserve">Varna (Speaker 1)  </w:t>
       </w:r>
       <w:r>
         <w:rPr>
@@ -11098,9 +11106,9 @@
       <w:r>
         <w:rPr>
           <w:b/>
-          <w:color w:val="2E74B5"/>
-        </w:rPr>
-        <w:t xml:space="preserve">Speaker 17  </w:t>
+          <w:color w:val="B52E2E"/>
+        </w:rPr>
+        <w:t xml:space="preserve">Yuvraj (Speaker 17)  </w:t>
       </w:r>
       <w:r>
         <w:rPr>
@@ -11323,9 +11331,9 @@
       <w:r>
         <w:rPr>
           <w:b/>
-          <w:color w:val="2E74B5"/>
-        </w:rPr>
-        <w:t xml:space="preserve">Varna (moderator) (Speaker 1)  </w:t>
+          <w:color w:val="B52E2E"/>
+        </w:rPr>
+        <w:t xml:space="preserve">Varna (Speaker 1)  </w:t>
       </w:r>
       <w:r>
         <w:rPr>
@@ -11473,9 +11481,9 @@
       <w:r>
         <w:rPr>
           <w:b/>
-          <w:color w:val="2E74B5"/>
-        </w:rPr>
-        <w:t xml:space="preserve">Varna (moderator) (Speaker 1)  </w:t>
+          <w:color w:val="B52E2E"/>
+        </w:rPr>
+        <w:t xml:space="preserve">Varna (Speaker 1)  </w:t>
       </w:r>
       <w:r>
         <w:rPr>
@@ -11523,9 +11531,9 @@
       <w:r>
         <w:rPr>
           <w:b/>
-          <w:color w:val="2E74B5"/>
-        </w:rPr>
-        <w:t xml:space="preserve">Varna (moderator) (Speaker 1)  </w:t>
+          <w:color w:val="B52E2E"/>
+        </w:rPr>
+        <w:t xml:space="preserve">Varna (Speaker 1)  </w:t>
       </w:r>
       <w:r>
         <w:rPr>
@@ -11548,9 +11556,9 @@
       <w:r>
         <w:rPr>
           <w:b/>
-          <w:color w:val="2E74B5"/>
-        </w:rPr>
-        <w:t xml:space="preserve">Speaker 17  </w:t>
+          <w:color w:val="B52E2E"/>
+        </w:rPr>
+        <w:t xml:space="preserve">Yuvraj (Speaker 17)  </w:t>
       </w:r>
       <w:r>
         <w:rPr>
@@ -11573,9 +11581,9 @@
       <w:r>
         <w:rPr>
           <w:b/>
-          <w:color w:val="2E74B5"/>
-        </w:rPr>
-        <w:t xml:space="preserve">Varna (moderator) (Speaker 1)  </w:t>
+          <w:color w:val="B52E2E"/>
+        </w:rPr>
+        <w:t xml:space="preserve">Varna (Speaker 1)  </w:t>
       </w:r>
       <w:r>
         <w:rPr>
@@ -11623,9 +11631,9 @@
       <w:r>
         <w:rPr>
           <w:b/>
-          <w:color w:val="2E74B5"/>
-        </w:rPr>
-        <w:t xml:space="preserve">Speaker 17  </w:t>
+          <w:color w:val="B52E2E"/>
+        </w:rPr>
+        <w:t xml:space="preserve">Yuvraj (Speaker 17)  </w:t>
       </w:r>
       <w:r>
         <w:rPr>
@@ -11698,9 +11706,9 @@
       <w:r>
         <w:rPr>
           <w:b/>
-          <w:color w:val="2E74B5"/>
-        </w:rPr>
-        <w:t xml:space="preserve">Speaker 17  </w:t>
+          <w:color w:val="B52E2E"/>
+        </w:rPr>
+        <w:t xml:space="preserve">Yuvraj (Speaker 17)  </w:t>
       </w:r>
       <w:r>
         <w:rPr>
@@ -11848,9 +11856,9 @@
       <w:r>
         <w:rPr>
           <w:b/>
-          <w:color w:val="2E74B5"/>
-        </w:rPr>
-        <w:t xml:space="preserve">Speaker 17  </w:t>
+          <w:color w:val="B52E2E"/>
+        </w:rPr>
+        <w:t xml:space="preserve">Yuvraj (Speaker 17)  </w:t>
       </w:r>
       <w:r>
         <w:rPr>
@@ -12023,9 +12031,9 @@
       <w:r>
         <w:rPr>
           <w:b/>
-          <w:color w:val="2E74B5"/>
-        </w:rPr>
-        <w:t xml:space="preserve">Varna (moderator) (Speaker 1)  </w:t>
+          <w:color w:val="B52E2E"/>
+        </w:rPr>
+        <w:t xml:space="preserve">Varna (Speaker 1)  </w:t>
       </w:r>
       <w:r>
         <w:rPr>
@@ -12048,9 +12056,9 @@
       <w:r>
         <w:rPr>
           <w:b/>
-          <w:color w:val="2E74B5"/>
-        </w:rPr>
-        <w:t xml:space="preserve">Speaker 17  </w:t>
+          <w:color w:val="B52E2E"/>
+        </w:rPr>
+        <w:t xml:space="preserve">Yuvraj (Speaker 17)  </w:t>
       </w:r>
       <w:r>
         <w:rPr>
@@ -12073,9 +12081,9 @@
       <w:r>
         <w:rPr>
           <w:b/>
-          <w:color w:val="2E74B5"/>
-        </w:rPr>
-        <w:t xml:space="preserve">Varna (moderator) (Speaker 1)  </w:t>
+          <w:color w:val="B52E2E"/>
+        </w:rPr>
+        <w:t xml:space="preserve">Varna (Speaker 1)  </w:t>
       </w:r>
       <w:r>
         <w:rPr>
@@ -12123,9 +12131,9 @@
       <w:r>
         <w:rPr>
           <w:b/>
-          <w:color w:val="2E74B5"/>
-        </w:rPr>
-        <w:t xml:space="preserve">Varna (moderator) (Speaker 1)  </w:t>
+          <w:color w:val="B52E2E"/>
+        </w:rPr>
+        <w:t xml:space="preserve">Varna (Speaker 1)  </w:t>
       </w:r>
       <w:r>
         <w:rPr>
@@ -12198,9 +12206,9 @@
       <w:r>
         <w:rPr>
           <w:b/>
-          <w:color w:val="2E74B5"/>
-        </w:rPr>
-        <w:t xml:space="preserve">Varna (moderator) (Speaker 1)  </w:t>
+          <w:color w:val="B52E2E"/>
+        </w:rPr>
+        <w:t xml:space="preserve">Varna (Speaker 1)  </w:t>
       </w:r>
       <w:r>
         <w:rPr>
@@ -12248,9 +12256,9 @@
       <w:r>
         <w:rPr>
           <w:b/>
-          <w:color w:val="2E74B5"/>
-        </w:rPr>
-        <w:t xml:space="preserve">Varna (moderator) (Speaker 1)  </w:t>
+          <w:color w:val="B52E2E"/>
+        </w:rPr>
+        <w:t xml:space="preserve">Varna (Speaker 1)  </w:t>
       </w:r>
       <w:r>
         <w:rPr>
@@ -12298,9 +12306,9 @@
       <w:r>
         <w:rPr>
           <w:b/>
-          <w:color w:val="2E74B5"/>
-        </w:rPr>
-        <w:t xml:space="preserve">Varna (moderator) (Speaker 1)  </w:t>
+          <w:color w:val="B52E2E"/>
+        </w:rPr>
+        <w:t xml:space="preserve">Varna (Speaker 1)  </w:t>
       </w:r>
       <w:r>
         <w:rPr>
@@ -12373,9 +12381,9 @@
       <w:r>
         <w:rPr>
           <w:b/>
-          <w:color w:val="2E74B5"/>
-        </w:rPr>
-        <w:t xml:space="preserve">Speaker 17  </w:t>
+          <w:color w:val="B52E2E"/>
+        </w:rPr>
+        <w:t xml:space="preserve">Yuvraj (Speaker 17)  </w:t>
       </w:r>
       <w:r>
         <w:rPr>
@@ -12423,9 +12431,9 @@
       <w:r>
         <w:rPr>
           <w:b/>
-          <w:color w:val="2E74B5"/>
-        </w:rPr>
-        <w:t xml:space="preserve">Speaker 17  </w:t>
+          <w:color w:val="B52E2E"/>
+        </w:rPr>
+        <w:t xml:space="preserve">Yuvraj (Speaker 17)  </w:t>
       </w:r>
       <w:r>
         <w:rPr>
@@ -12523,9 +12531,9 @@
       <w:r>
         <w:rPr>
           <w:b/>
-          <w:color w:val="2E74B5"/>
-        </w:rPr>
-        <w:t xml:space="preserve">Speaker 17  </w:t>
+          <w:color w:val="B52E2E"/>
+        </w:rPr>
+        <w:t xml:space="preserve">Yuvraj (Speaker 17)  </w:t>
       </w:r>
       <w:r>
         <w:rPr>
@@ -12623,9 +12631,9 @@
       <w:r>
         <w:rPr>
           <w:b/>
-          <w:color w:val="2E74B5"/>
-        </w:rPr>
-        <w:t xml:space="preserve">Varna (moderator) (Speaker 1)  </w:t>
+          <w:color w:val="B52E2E"/>
+        </w:rPr>
+        <w:t xml:space="preserve">Varna (Speaker 1)  </w:t>
       </w:r>
       <w:r>
         <w:rPr>
@@ -12648,9 +12656,9 @@
       <w:r>
         <w:rPr>
           <w:b/>
-          <w:color w:val="2E74B5"/>
-        </w:rPr>
-        <w:t xml:space="preserve">Speaker 17  </w:t>
+          <w:color w:val="B52E2E"/>
+        </w:rPr>
+        <w:t xml:space="preserve">Yuvraj (Speaker 17)  </w:t>
       </w:r>
       <w:r>
         <w:rPr>
@@ -12698,9 +12706,9 @@
       <w:r>
         <w:rPr>
           <w:b/>
-          <w:color w:val="2E74B5"/>
-        </w:rPr>
-        <w:t xml:space="preserve">Speaker 17  </w:t>
+          <w:color w:val="B52E2E"/>
+        </w:rPr>
+        <w:t xml:space="preserve">Yuvraj (Speaker 17)  </w:t>
       </w:r>
       <w:r>
         <w:rPr>
@@ -12748,9 +12756,9 @@
       <w:r>
         <w:rPr>
           <w:b/>
-          <w:color w:val="2E74B5"/>
-        </w:rPr>
-        <w:t xml:space="preserve">Speaker 17  </w:t>
+          <w:color w:val="B52E2E"/>
+        </w:rPr>
+        <w:t xml:space="preserve">Yuvraj (Speaker 17)  </w:t>
       </w:r>
       <w:r>
         <w:rPr>
@@ -12798,9 +12806,9 @@
       <w:r>
         <w:rPr>
           <w:b/>
-          <w:color w:val="2E74B5"/>
-        </w:rPr>
-        <w:t xml:space="preserve">Speaker 17  </w:t>
+          <w:color w:val="B52E2E"/>
+        </w:rPr>
+        <w:t xml:space="preserve">Yuvraj (Speaker 17)  </w:t>
       </w:r>
       <w:r>
         <w:rPr>
@@ -12886,9 +12894,9 @@
       <w:r>
         <w:rPr>
           <w:b/>
-          <w:color w:val="2E74B5"/>
-        </w:rPr>
-        <w:t xml:space="preserve">Speaker 17  </w:t>
+          <w:color w:val="B52E2E"/>
+        </w:rPr>
+        <w:t xml:space="preserve">Yuvraj (Speaker 17)  </w:t>
       </w:r>
       <w:r>
         <w:rPr>
@@ -12961,9 +12969,9 @@
       <w:r>
         <w:rPr>
           <w:b/>
-          <w:color w:val="2E74B5"/>
-        </w:rPr>
-        <w:t xml:space="preserve">Varna (moderator) (Speaker 1)  </w:t>
+          <w:color w:val="B52E2E"/>
+        </w:rPr>
+        <w:t xml:space="preserve">Varna (Speaker 1)  </w:t>
       </w:r>
       <w:r>
         <w:rPr>
@@ -13061,9 +13069,9 @@
       <w:r>
         <w:rPr>
           <w:b/>
-          <w:color w:val="2E74B5"/>
-        </w:rPr>
-        <w:t xml:space="preserve">Speaker 17  </w:t>
+          <w:color w:val="B52E2E"/>
+        </w:rPr>
+        <w:t xml:space="preserve">Yuvraj (Speaker 17)  </w:t>
       </w:r>
       <w:r>
         <w:rPr>
@@ -13136,9 +13144,9 @@
       <w:r>
         <w:rPr>
           <w:b/>
-          <w:color w:val="2E74B5"/>
-        </w:rPr>
-        <w:t xml:space="preserve">Speaker 17  </w:t>
+          <w:color w:val="B52E2E"/>
+        </w:rPr>
+        <w:t xml:space="preserve">Yuvraj (Speaker 17)  </w:t>
       </w:r>
       <w:r>
         <w:rPr>
@@ -13361,9 +13369,9 @@
       <w:r>
         <w:rPr>
           <w:b/>
-          <w:color w:val="2E74B5"/>
-        </w:rPr>
-        <w:t xml:space="preserve">Speaker 17  </w:t>
+          <w:color w:val="B52E2E"/>
+        </w:rPr>
+        <w:t xml:space="preserve">Yuvraj (Speaker 17)  </w:t>
       </w:r>
       <w:r>
         <w:rPr>
@@ -13411,9 +13419,9 @@
       <w:r>
         <w:rPr>
           <w:b/>
-          <w:color w:val="2E74B5"/>
-        </w:rPr>
-        <w:t xml:space="preserve">Speaker 17  </w:t>
+          <w:color w:val="B52E2E"/>
+        </w:rPr>
+        <w:t xml:space="preserve">Yuvraj (Speaker 17)  </w:t>
       </w:r>
       <w:r>
         <w:rPr>
@@ -13511,9 +13519,9 @@
       <w:r>
         <w:rPr>
           <w:b/>
-          <w:color w:val="2E74B5"/>
-        </w:rPr>
-        <w:t xml:space="preserve">Speaker 17  </w:t>
+          <w:color w:val="B52E2E"/>
+        </w:rPr>
+        <w:t xml:space="preserve">Yuvraj (Speaker 17)  </w:t>
       </w:r>
       <w:r>
         <w:rPr>
@@ -13736,9 +13744,9 @@
       <w:r>
         <w:rPr>
           <w:b/>
-          <w:color w:val="2E74B5"/>
-        </w:rPr>
-        <w:t xml:space="preserve">Speaker 17  </w:t>
+          <w:color w:val="B52E2E"/>
+        </w:rPr>
+        <w:t xml:space="preserve">Yuvraj (Speaker 17)  </w:t>
       </w:r>
       <w:r>
         <w:rPr>
@@ -13911,9 +13919,9 @@
       <w:r>
         <w:rPr>
           <w:b/>
-          <w:color w:val="2E74B5"/>
-        </w:rPr>
-        <w:t xml:space="preserve">Varna (moderator) (Speaker 1)  </w:t>
+          <w:color w:val="B52E2E"/>
+        </w:rPr>
+        <w:t xml:space="preserve">Varna (Speaker 1)  </w:t>
       </w:r>
       <w:r>
         <w:rPr>
@@ -13961,9 +13969,9 @@
       <w:r>
         <w:rPr>
           <w:b/>
-          <w:color w:val="2E74B5"/>
-        </w:rPr>
-        <w:t xml:space="preserve">Varna (moderator) (Speaker 1)  </w:t>
+          <w:color w:val="B52E2E"/>
+        </w:rPr>
+        <w:t xml:space="preserve">Varna (Speaker 1)  </w:t>
       </w:r>
       <w:r>
         <w:rPr>
@@ -14011,9 +14019,9 @@
       <w:r>
         <w:rPr>
           <w:b/>
-          <w:color w:val="2E74B5"/>
-        </w:rPr>
-        <w:t xml:space="preserve">Varna (moderator) (Speaker 1)  </w:t>
+          <w:color w:val="B52E2E"/>
+        </w:rPr>
+        <w:t xml:space="preserve">Varna (Speaker 1)  </w:t>
       </w:r>
       <w:r>
         <w:rPr>
@@ -14236,9 +14244,9 @@
       <w:r>
         <w:rPr>
           <w:b/>
-          <w:color w:val="2E74B5"/>
-        </w:rPr>
-        <w:t xml:space="preserve">Speaker 17  </w:t>
+          <w:color w:val="B52E2E"/>
+        </w:rPr>
+        <w:t xml:space="preserve">Yuvraj (Speaker 17)  </w:t>
       </w:r>
       <w:r>
         <w:rPr>
@@ -14461,9 +14469,9 @@
       <w:r>
         <w:rPr>
           <w:b/>
-          <w:color w:val="2E74B5"/>
-        </w:rPr>
-        <w:t xml:space="preserve">Varna (moderator) (Speaker 1)  </w:t>
+          <w:color w:val="B52E2E"/>
+        </w:rPr>
+        <w:t xml:space="preserve">Varna (Speaker 1)  </w:t>
       </w:r>
       <w:r>
         <w:rPr>
@@ -14486,9 +14494,9 @@
       <w:r>
         <w:rPr>
           <w:b/>
-          <w:color w:val="2E74B5"/>
-        </w:rPr>
-        <w:t xml:space="preserve">Speaker 17  </w:t>
+          <w:color w:val="B52E2E"/>
+        </w:rPr>
+        <w:t xml:space="preserve">Yuvraj (Speaker 17)  </w:t>
       </w:r>
       <w:r>
         <w:rPr>
@@ -14536,9 +14544,9 @@
       <w:r>
         <w:rPr>
           <w:b/>
-          <w:color w:val="2E74B5"/>
-        </w:rPr>
-        <w:t xml:space="preserve">Speaker 17  </w:t>
+          <w:color w:val="B52E2E"/>
+        </w:rPr>
+        <w:t xml:space="preserve">Yuvraj (Speaker 17)  </w:t>
       </w:r>
       <w:r>
         <w:rPr>
@@ -14586,9 +14594,9 @@
       <w:r>
         <w:rPr>
           <w:b/>
-          <w:color w:val="2E74B5"/>
-        </w:rPr>
-        <w:t xml:space="preserve">Speaker 17  </w:t>
+          <w:color w:val="B52E2E"/>
+        </w:rPr>
+        <w:t xml:space="preserve">Yuvraj (Speaker 17)  </w:t>
       </w:r>
       <w:r>
         <w:rPr>
@@ -14636,9 +14644,9 @@
       <w:r>
         <w:rPr>
           <w:b/>
-          <w:color w:val="2E74B5"/>
-        </w:rPr>
-        <w:t xml:space="preserve">Speaker 17  </w:t>
+          <w:color w:val="B52E2E"/>
+        </w:rPr>
+        <w:t xml:space="preserve">Yuvraj (Speaker 17)  </w:t>
       </w:r>
       <w:r>
         <w:rPr>
@@ -14886,9 +14894,9 @@
       <w:r>
         <w:rPr>
           <w:b/>
-          <w:color w:val="2E74B5"/>
-        </w:rPr>
-        <w:t xml:space="preserve">Speaker 17  </w:t>
+          <w:color w:val="B52E2E"/>
+        </w:rPr>
+        <w:t xml:space="preserve">Yuvraj (Speaker 17)  </w:t>
       </w:r>
       <w:r>
         <w:rPr>
@@ -14961,9 +14969,9 @@
       <w:r>
         <w:rPr>
           <w:b/>
-          <w:color w:val="2E74B5"/>
-        </w:rPr>
-        <w:t xml:space="preserve">Speaker 17  </w:t>
+          <w:color w:val="B52E2E"/>
+        </w:rPr>
+        <w:t xml:space="preserve">Yuvraj (Speaker 17)  </w:t>
       </w:r>
       <w:r>
         <w:rPr>
@@ -15163,7 +15171,7 @@
           <w:b/>
           <w:color w:val="2E74B5"/>
         </w:rPr>
-        <w:t xml:space="preserve">Arun Nagar (Speaker 14)  </w:t>
+        <w:t xml:space="preserve">Speaker 14 (name unclear)  </w:t>
       </w:r>
       <w:r>
         <w:rPr>
@@ -15213,7 +15221,7 @@
           <w:b/>
           <w:color w:val="2E74B5"/>
         </w:rPr>
-        <w:t xml:space="preserve">Arun Nagar (Speaker 14)  </w:t>
+        <w:t xml:space="preserve">Speaker 14 (name unclear)  </w:t>
       </w:r>
       <w:r>
         <w:rPr>
@@ -15261,9 +15269,9 @@
       <w:r>
         <w:rPr>
           <w:b/>
-          <w:color w:val="2E74B5"/>
-        </w:rPr>
-        <w:t xml:space="preserve">Varna (moderator) (Speaker 1)  </w:t>
+          <w:color w:val="B52E2E"/>
+        </w:rPr>
+        <w:t xml:space="preserve">Varna (Speaker 1)  </w:t>
       </w:r>
       <w:r>
         <w:rPr>
@@ -15288,7 +15296,7 @@
           <w:b/>
           <w:color w:val="2E74B5"/>
         </w:rPr>
-        <w:t xml:space="preserve">Arun Nagar (Speaker 14)  </w:t>
+        <w:t xml:space="preserve">Speaker 14 (name unclear)  </w:t>
       </w:r>
       <w:r>
         <w:rPr>
@@ -15361,9 +15369,9 @@
       <w:r>
         <w:rPr>
           <w:b/>
-          <w:color w:val="2E74B5"/>
-        </w:rPr>
-        <w:t xml:space="preserve">Varna (moderator) (Speaker 1)  </w:t>
+          <w:color w:val="B52E2E"/>
+        </w:rPr>
+        <w:t xml:space="preserve">Varna (Speaker 1)  </w:t>
       </w:r>
       <w:r>
         <w:rPr>
@@ -15611,9 +15619,9 @@
       <w:r>
         <w:rPr>
           <w:b/>
-          <w:color w:val="2E74B5"/>
-        </w:rPr>
-        <w:t xml:space="preserve">Speaker 17  </w:t>
+          <w:color w:val="B52E2E"/>
+        </w:rPr>
+        <w:t xml:space="preserve">Yuvraj (Speaker 17)  </w:t>
       </w:r>
       <w:r>
         <w:rPr>
@@ -15663,7 +15671,7 @@
           <w:b/>
           <w:color w:val="2E74B5"/>
         </w:rPr>
-        <w:t xml:space="preserve">Arun Nagar (Speaker 14)  </w:t>
+        <w:t xml:space="preserve">Speaker 14 (name unclear)  </w:t>
       </w:r>
       <w:r>
         <w:rPr>
@@ -15711,9 +15719,9 @@
       <w:r>
         <w:rPr>
           <w:b/>
-          <w:color w:val="2E74B5"/>
-        </w:rPr>
-        <w:t xml:space="preserve">Speaker 17  </w:t>
+          <w:color w:val="B52E2E"/>
+        </w:rPr>
+        <w:t xml:space="preserve">Yuvraj (Speaker 17)  </w:t>
       </w:r>
       <w:r>
         <w:rPr>
@@ -15811,9 +15819,9 @@
       <w:r>
         <w:rPr>
           <w:b/>
-          <w:color w:val="2E74B5"/>
-        </w:rPr>
-        <w:t xml:space="preserve">Speaker 17  </w:t>
+          <w:color w:val="B52E2E"/>
+        </w:rPr>
+        <w:t xml:space="preserve">Yuvraj (Speaker 17)  </w:t>
       </w:r>
       <w:r>
         <w:rPr>
@@ -15861,9 +15869,9 @@
       <w:r>
         <w:rPr>
           <w:b/>
-          <w:color w:val="2E74B5"/>
-        </w:rPr>
-        <w:t xml:space="preserve">Speaker 17  </w:t>
+          <w:color w:val="B52E2E"/>
+        </w:rPr>
+        <w:t xml:space="preserve">Yuvraj (Speaker 17)  </w:t>
       </w:r>
       <w:r>
         <w:rPr>
@@ -15936,9 +15944,9 @@
       <w:r>
         <w:rPr>
           <w:b/>
-          <w:color w:val="2E74B5"/>
-        </w:rPr>
-        <w:t xml:space="preserve">Speaker 17  </w:t>
+          <w:color w:val="B52E2E"/>
+        </w:rPr>
+        <w:t xml:space="preserve">Yuvraj (Speaker 17)  </w:t>
       </w:r>
       <w:r>
         <w:rPr>
@@ -16761,9 +16769,9 @@
       <w:r>
         <w:rPr>
           <w:b/>
-          <w:color w:val="2E74B5"/>
-        </w:rPr>
-        <w:t xml:space="preserve">Speaker 17  </w:t>
+          <w:color w:val="B52E2E"/>
+        </w:rPr>
+        <w:t xml:space="preserve">Yuvraj (Speaker 17)  </w:t>
       </w:r>
       <w:r>
         <w:rPr>
@@ -16986,9 +16994,9 @@
       <w:r>
         <w:rPr>
           <w:b/>
-          <w:color w:val="2E74B5"/>
-        </w:rPr>
-        <w:t xml:space="preserve">Speaker 17  </w:t>
+          <w:color w:val="B52E2E"/>
+        </w:rPr>
+        <w:t xml:space="preserve">Yuvraj (Speaker 17)  </w:t>
       </w:r>
       <w:r>
         <w:rPr>
@@ -17036,9 +17044,9 @@
       <w:r>
         <w:rPr>
           <w:b/>
-          <w:color w:val="2E74B5"/>
-        </w:rPr>
-        <w:t xml:space="preserve">Speaker 17  </w:t>
+          <w:color w:val="B52E2E"/>
+        </w:rPr>
+        <w:t xml:space="preserve">Yuvraj (Speaker 17)  </w:t>
       </w:r>
       <w:r>
         <w:rPr>
@@ -17111,9 +17119,9 @@
       <w:r>
         <w:rPr>
           <w:b/>
-          <w:color w:val="2E74B5"/>
-        </w:rPr>
-        <w:t xml:space="preserve">Speaker 17  </w:t>
+          <w:color w:val="B52E2E"/>
+        </w:rPr>
+        <w:t xml:space="preserve">Yuvraj (Speaker 17)  </w:t>
       </w:r>
       <w:r>
         <w:rPr>
@@ -17161,9 +17169,9 @@
       <w:r>
         <w:rPr>
           <w:b/>
-          <w:color w:val="2E74B5"/>
-        </w:rPr>
-        <w:t xml:space="preserve">Speaker 17  </w:t>
+          <w:color w:val="B52E2E"/>
+        </w:rPr>
+        <w:t xml:space="preserve">Yuvraj (Speaker 17)  </w:t>
       </w:r>
       <w:r>
         <w:rPr>
@@ -17261,9 +17269,9 @@
       <w:r>
         <w:rPr>
           <w:b/>
-          <w:color w:val="2E74B5"/>
-        </w:rPr>
-        <w:t xml:space="preserve">Speaker 17  </w:t>
+          <w:color w:val="B52E2E"/>
+        </w:rPr>
+        <w:t xml:space="preserve">Yuvraj (Speaker 17)  </w:t>
       </w:r>
       <w:r>
         <w:rPr>
@@ -17386,9 +17394,9 @@
       <w:r>
         <w:rPr>
           <w:b/>
-          <w:color w:val="2E74B5"/>
-        </w:rPr>
-        <w:t xml:space="preserve">Speaker 17  </w:t>
+          <w:color w:val="B52E2E"/>
+        </w:rPr>
+        <w:t xml:space="preserve">Yuvraj (Speaker 17)  </w:t>
       </w:r>
       <w:r>
         <w:rPr>
@@ -17461,9 +17469,9 @@
       <w:r>
         <w:rPr>
           <w:b/>
-          <w:color w:val="2E74B5"/>
-        </w:rPr>
-        <w:t xml:space="preserve">Speaker 17  </w:t>
+          <w:color w:val="B52E2E"/>
+        </w:rPr>
+        <w:t xml:space="preserve">Yuvraj (Speaker 17)  </w:t>
       </w:r>
       <w:r>
         <w:rPr>
@@ -17486,9 +17494,9 @@
       <w:r>
         <w:rPr>
           <w:b/>
-          <w:color w:val="2E74B5"/>
-        </w:rPr>
-        <w:t xml:space="preserve">Varna (moderator) (Speaker 1)  </w:t>
+          <w:color w:val="B52E2E"/>
+        </w:rPr>
+        <w:t xml:space="preserve">Varna (Speaker 1)  </w:t>
       </w:r>
       <w:r>
         <w:rPr>
@@ -17536,9 +17544,9 @@
       <w:r>
         <w:rPr>
           <w:b/>
-          <w:color w:val="2E74B5"/>
-        </w:rPr>
-        <w:t xml:space="preserve">Varna (moderator) (Speaker 1)  </w:t>
+          <w:color w:val="B52E2E"/>
+        </w:rPr>
+        <w:t xml:space="preserve">Varna (Speaker 1)  </w:t>
       </w:r>
       <w:r>
         <w:rPr>
@@ -17586,9 +17594,9 @@
       <w:r>
         <w:rPr>
           <w:b/>
-          <w:color w:val="2E74B5"/>
-        </w:rPr>
-        <w:t xml:space="preserve">Speaker 17  </w:t>
+          <w:color w:val="B52E2E"/>
+        </w:rPr>
+        <w:t xml:space="preserve">Yuvraj (Speaker 17)  </w:t>
       </w:r>
       <w:r>
         <w:rPr>
@@ -17636,9 +17644,9 @@
       <w:r>
         <w:rPr>
           <w:b/>
-          <w:color w:val="2E74B5"/>
-        </w:rPr>
-        <w:t xml:space="preserve">Varna (moderator) (Speaker 1)  </w:t>
+          <w:color w:val="B52E2E"/>
+        </w:rPr>
+        <w:t xml:space="preserve">Varna (Speaker 1)  </w:t>
       </w:r>
       <w:r>
         <w:rPr>
@@ -17961,9 +17969,9 @@
       <w:r>
         <w:rPr>
           <w:b/>
-          <w:color w:val="2E74B5"/>
-        </w:rPr>
-        <w:t xml:space="preserve">Speaker 17  </w:t>
+          <w:color w:val="B52E2E"/>
+        </w:rPr>
+        <w:t xml:space="preserve">Yuvraj (Speaker 17)  </w:t>
       </w:r>
       <w:r>
         <w:rPr>
@@ -18086,9 +18094,9 @@
       <w:r>
         <w:rPr>
           <w:b/>
-          <w:color w:val="2E74B5"/>
-        </w:rPr>
-        <w:t xml:space="preserve">Varna (moderator) (Speaker 1)  </w:t>
+          <w:color w:val="B52E2E"/>
+        </w:rPr>
+        <w:t xml:space="preserve">Varna (Speaker 1)  </w:t>
       </w:r>
       <w:r>
         <w:rPr>
@@ -18111,9 +18119,9 @@
       <w:r>
         <w:rPr>
           <w:b/>
-          <w:color w:val="2E74B5"/>
-        </w:rPr>
-        <w:t xml:space="preserve">Speaker 17  </w:t>
+          <w:color w:val="B52E2E"/>
+        </w:rPr>
+        <w:t xml:space="preserve">Yuvraj (Speaker 17)  </w:t>
       </w:r>
       <w:r>
         <w:rPr>
@@ -18136,9 +18144,9 @@
       <w:r>
         <w:rPr>
           <w:b/>
-          <w:color w:val="2E74B5"/>
-        </w:rPr>
-        <w:t xml:space="preserve">Varna (moderator) (Speaker 1)  </w:t>
+          <w:color w:val="B52E2E"/>
+        </w:rPr>
+        <w:t xml:space="preserve">Varna (Speaker 1)  </w:t>
       </w:r>
       <w:r>
         <w:rPr>
@@ -18211,9 +18219,9 @@
       <w:r>
         <w:rPr>
           <w:b/>
-          <w:color w:val="2E74B5"/>
-        </w:rPr>
-        <w:t xml:space="preserve">Speaker 17  </w:t>
+          <w:color w:val="B52E2E"/>
+        </w:rPr>
+        <w:t xml:space="preserve">Yuvraj (Speaker 17)  </w:t>
       </w:r>
       <w:r>
         <w:rPr>
@@ -18261,9 +18269,9 @@
       <w:r>
         <w:rPr>
           <w:b/>
-          <w:color w:val="2E74B5"/>
-        </w:rPr>
-        <w:t xml:space="preserve">Speaker 17  </w:t>
+          <w:color w:val="B52E2E"/>
+        </w:rPr>
+        <w:t xml:space="preserve">Yuvraj (Speaker 17)  </w:t>
       </w:r>
       <w:r>
         <w:rPr>
@@ -18361,9 +18369,9 @@
       <w:r>
         <w:rPr>
           <w:b/>
-          <w:color w:val="2E74B5"/>
-        </w:rPr>
-        <w:t xml:space="preserve">Speaker 17  </w:t>
+          <w:color w:val="B52E2E"/>
+        </w:rPr>
+        <w:t xml:space="preserve">Yuvraj (Speaker 17)  </w:t>
       </w:r>
       <w:r>
         <w:rPr>
@@ -18411,9 +18419,9 @@
       <w:r>
         <w:rPr>
           <w:b/>
-          <w:color w:val="2E74B5"/>
-        </w:rPr>
-        <w:t xml:space="preserve">Speaker 17  </w:t>
+          <w:color w:val="B52E2E"/>
+        </w:rPr>
+        <w:t xml:space="preserve">Yuvraj (Speaker 17)  </w:t>
       </w:r>
       <w:r>
         <w:rPr>
@@ -18561,9 +18569,9 @@
       <w:r>
         <w:rPr>
           <w:b/>
-          <w:color w:val="2E74B5"/>
-        </w:rPr>
-        <w:t xml:space="preserve">Speaker 17  </w:t>
+          <w:color w:val="B52E2E"/>
+        </w:rPr>
+        <w:t xml:space="preserve">Yuvraj (Speaker 17)  </w:t>
       </w:r>
       <w:r>
         <w:rPr>
@@ -18738,7 +18746,7 @@
           <w:b/>
           <w:color w:val="2E74B5"/>
         </w:rPr>
-        <w:t xml:space="preserve">Arun Nagar (Speaker 14)  </w:t>
+        <w:t xml:space="preserve">Speaker 14 (name unclear)  </w:t>
       </w:r>
       <w:r>
         <w:rPr>
@@ -18786,9 +18794,9 @@
       <w:r>
         <w:rPr>
           <w:b/>
-          <w:color w:val="2E74B5"/>
-        </w:rPr>
-        <w:t xml:space="preserve">Speaker 17  </w:t>
+          <w:color w:val="B52E2E"/>
+        </w:rPr>
+        <w:t xml:space="preserve">Yuvraj (Speaker 17)  </w:t>
       </w:r>
       <w:r>
         <w:rPr>
@@ -18836,9 +18844,9 @@
       <w:r>
         <w:rPr>
           <w:b/>
-          <w:color w:val="2E74B5"/>
-        </w:rPr>
-        <w:t xml:space="preserve">Speaker 17  </w:t>
+          <w:color w:val="B52E2E"/>
+        </w:rPr>
+        <w:t xml:space="preserve">Yuvraj (Speaker 17)  </w:t>
       </w:r>
       <w:r>
         <w:rPr>
@@ -18911,9 +18919,9 @@
       <w:r>
         <w:rPr>
           <w:b/>
-          <w:color w:val="2E74B5"/>
-        </w:rPr>
-        <w:t xml:space="preserve">Speaker 17  </w:t>
+          <w:color w:val="B52E2E"/>
+        </w:rPr>
+        <w:t xml:space="preserve">Yuvraj (Speaker 17)  </w:t>
       </w:r>
       <w:r>
         <w:rPr>
@@ -18936,9 +18944,9 @@
       <w:r>
         <w:rPr>
           <w:b/>
-          <w:color w:val="2E74B5"/>
-        </w:rPr>
-        <w:t xml:space="preserve">Varna (moderator) (Speaker 1)  </w:t>
+          <w:color w:val="B52E2E"/>
+        </w:rPr>
+        <w:t xml:space="preserve">Varna (Speaker 1)  </w:t>
       </w:r>
       <w:r>
         <w:rPr>
@@ -18961,9 +18969,9 @@
       <w:r>
         <w:rPr>
           <w:b/>
-          <w:color w:val="2E74B5"/>
-        </w:rPr>
-        <w:t xml:space="preserve">Speaker 17  </w:t>
+          <w:color w:val="B52E2E"/>
+        </w:rPr>
+        <w:t xml:space="preserve">Yuvraj (Speaker 17)  </w:t>
       </w:r>
       <w:r>
         <w:rPr>
@@ -18986,9 +18994,9 @@
       <w:r>
         <w:rPr>
           <w:b/>
-          <w:color w:val="2E74B5"/>
-        </w:rPr>
-        <w:t xml:space="preserve">Varna (moderator) (Speaker 1)  </w:t>
+          <w:color w:val="B52E2E"/>
+        </w:rPr>
+        <w:t xml:space="preserve">Varna (Speaker 1)  </w:t>
       </w:r>
       <w:r>
         <w:rPr>
@@ -19011,9 +19019,9 @@
       <w:r>
         <w:rPr>
           <w:b/>
-          <w:color w:val="2E74B5"/>
-        </w:rPr>
-        <w:t xml:space="preserve">Speaker 17  </w:t>
+          <w:color w:val="B52E2E"/>
+        </w:rPr>
+        <w:t xml:space="preserve">Yuvraj (Speaker 17)  </w:t>
       </w:r>
       <w:r>
         <w:rPr>
@@ -19211,9 +19219,9 @@
       <w:r>
         <w:rPr>
           <w:b/>
-          <w:color w:val="2E74B5"/>
-        </w:rPr>
-        <w:t xml:space="preserve">Speaker 17  </w:t>
+          <w:color w:val="B52E2E"/>
+        </w:rPr>
+        <w:t xml:space="preserve">Yuvraj (Speaker 17)  </w:t>
       </w:r>
       <w:r>
         <w:rPr>
@@ -19311,9 +19319,9 @@
       <w:r>
         <w:rPr>
           <w:b/>
-          <w:color w:val="2E74B5"/>
-        </w:rPr>
-        <w:t xml:space="preserve">Varna (moderator) (Speaker 1)  </w:t>
+          <w:color w:val="B52E2E"/>
+        </w:rPr>
+        <w:t xml:space="preserve">Varna (Speaker 1)  </w:t>
       </w:r>
       <w:r>
         <w:rPr>
@@ -19511,9 +19519,9 @@
       <w:r>
         <w:rPr>
           <w:b/>
-          <w:color w:val="2E74B5"/>
-        </w:rPr>
-        <w:t xml:space="preserve">Varna (moderator) (Speaker 1)  </w:t>
+          <w:color w:val="B52E2E"/>
+        </w:rPr>
+        <w:t xml:space="preserve">Varna (Speaker 1)  </w:t>
       </w:r>
       <w:r>
         <w:rPr>
@@ -19586,9 +19594,9 @@
       <w:r>
         <w:rPr>
           <w:b/>
-          <w:color w:val="2E74B5"/>
-        </w:rPr>
-        <w:t xml:space="preserve">Varna (moderator) (Speaker 1)  </w:t>
+          <w:color w:val="B52E2E"/>
+        </w:rPr>
+        <w:t xml:space="preserve">Varna (Speaker 1)  </w:t>
       </w:r>
       <w:r>
         <w:rPr>
@@ -19661,9 +19669,9 @@
       <w:r>
         <w:rPr>
           <w:b/>
-          <w:color w:val="2E74B5"/>
-        </w:rPr>
-        <w:t xml:space="preserve">Varna (moderator) (Speaker 1)  </w:t>
+          <w:color w:val="B52E2E"/>
+        </w:rPr>
+        <w:t xml:space="preserve">Varna (Speaker 1)  </w:t>
       </w:r>
       <w:r>
         <w:rPr>
@@ -19761,9 +19769,9 @@
       <w:r>
         <w:rPr>
           <w:b/>
-          <w:color w:val="2E74B5"/>
-        </w:rPr>
-        <w:t xml:space="preserve">Speaker 17  </w:t>
+          <w:color w:val="B52E2E"/>
+        </w:rPr>
+        <w:t xml:space="preserve">Yuvraj (Speaker 17)  </w:t>
       </w:r>
       <w:r>
         <w:rPr>
@@ -19836,9 +19844,9 @@
       <w:r>
         <w:rPr>
           <w:b/>
-          <w:color w:val="2E74B5"/>
-        </w:rPr>
-        <w:t xml:space="preserve">Varna (moderator) (Speaker 1)  </w:t>
+          <w:color w:val="B52E2E"/>
+        </w:rPr>
+        <w:t xml:space="preserve">Varna (Speaker 1)  </w:t>
       </w:r>
       <w:r>
         <w:rPr>
@@ -19913,7 +19921,7 @@
           <w:b/>
           <w:color w:val="2E74B5"/>
         </w:rPr>
-        <w:t xml:space="preserve">Arun Nagar (Speaker 14)  </w:t>
+        <w:t xml:space="preserve">Speaker 14 (name unclear)  </w:t>
       </w:r>
       <w:r>
         <w:rPr>
@@ -19936,9 +19944,9 @@
       <w:r>
         <w:rPr>
           <w:b/>
-          <w:color w:val="2E74B5"/>
-        </w:rPr>
-        <w:t xml:space="preserve">Speaker 17  </w:t>
+          <w:color w:val="B52E2E"/>
+        </w:rPr>
+        <w:t xml:space="preserve">Yuvraj (Speaker 17)  </w:t>
       </w:r>
       <w:r>
         <w:rPr>
@@ -19963,7 +19971,7 @@
           <w:b/>
           <w:color w:val="2E74B5"/>
         </w:rPr>
-        <w:t xml:space="preserve">Arun Nagar (Speaker 14)  </w:t>
+        <w:t xml:space="preserve">Speaker 14 (name unclear)  </w:t>
       </w:r>
       <w:r>
         <w:rPr>
@@ -19986,9 +19994,9 @@
       <w:r>
         <w:rPr>
           <w:b/>
-          <w:color w:val="2E74B5"/>
-        </w:rPr>
-        <w:t xml:space="preserve">Speaker 17  </w:t>
+          <w:color w:val="B52E2E"/>
+        </w:rPr>
+        <w:t xml:space="preserve">Yuvraj (Speaker 17)  </w:t>
       </w:r>
       <w:r>
         <w:rPr>
@@ -20013,7 +20021,7 @@
           <w:b/>
           <w:color w:val="2E74B5"/>
         </w:rPr>
-        <w:t xml:space="preserve">Arun Nagar (Speaker 14)  </w:t>
+        <w:t xml:space="preserve">Speaker 14 (name unclear)  </w:t>
       </w:r>
       <w:r>
         <w:rPr>
@@ -20088,7 +20096,7 @@
           <w:b/>
           <w:color w:val="2E74B5"/>
         </w:rPr>
-        <w:t xml:space="preserve">Arun Nagar (Speaker 14)  </w:t>
+        <w:t xml:space="preserve">Speaker 14 (name unclear)  </w:t>
       </w:r>
       <w:r>
         <w:rPr>
@@ -20163,7 +20171,7 @@
           <w:b/>
           <w:color w:val="2E74B5"/>
         </w:rPr>
-        <w:t xml:space="preserve">Arun Nagar (Speaker 14)  </w:t>
+        <w:t xml:space="preserve">Speaker 14 (name unclear)  </w:t>
       </w:r>
       <w:r>
         <w:rPr>
@@ -20236,9 +20244,9 @@
       <w:r>
         <w:rPr>
           <w:b/>
-          <w:color w:val="2E74B5"/>
-        </w:rPr>
-        <w:t xml:space="preserve">Speaker 17  </w:t>
+          <w:color w:val="B52E2E"/>
+        </w:rPr>
+        <w:t xml:space="preserve">Yuvraj (Speaker 17)  </w:t>
       </w:r>
       <w:r>
         <w:rPr>
@@ -20263,7 +20271,7 @@
           <w:b/>
           <w:color w:val="2E74B5"/>
         </w:rPr>
-        <w:t xml:space="preserve">Arun Nagar (Speaker 14)  </w:t>
+        <w:t xml:space="preserve">Speaker 14 (name unclear)  </w:t>
       </w:r>
       <w:r>
         <w:rPr>
@@ -20286,9 +20294,9 @@
       <w:r>
         <w:rPr>
           <w:b/>
-          <w:color w:val="2E74B5"/>
-        </w:rPr>
-        <w:t xml:space="preserve">Speaker 17  </w:t>
+          <w:color w:val="B52E2E"/>
+        </w:rPr>
+        <w:t xml:space="preserve">Yuvraj (Speaker 17)  </w:t>
       </w:r>
       <w:r>
         <w:rPr>
@@ -20336,9 +20344,9 @@
       <w:r>
         <w:rPr>
           <w:b/>
-          <w:color w:val="2E74B5"/>
-        </w:rPr>
-        <w:t xml:space="preserve">Speaker 17  </w:t>
+          <w:color w:val="B52E2E"/>
+        </w:rPr>
+        <w:t xml:space="preserve">Yuvraj (Speaker 17)  </w:t>
       </w:r>
       <w:r>
         <w:rPr>
@@ -20861,9 +20869,9 @@
       <w:r>
         <w:rPr>
           <w:b/>
-          <w:color w:val="2E74B5"/>
-        </w:rPr>
-        <w:t xml:space="preserve">Speaker 17  </w:t>
+          <w:color w:val="B52E2E"/>
+        </w:rPr>
+        <w:t xml:space="preserve">Yuvraj (Speaker 17)  </w:t>
       </w:r>
       <w:r>
         <w:rPr>
@@ -21261,9 +21269,9 @@
       <w:r>
         <w:rPr>
           <w:b/>
-          <w:color w:val="2E74B5"/>
-        </w:rPr>
-        <w:t xml:space="preserve">Varna (moderator) (Speaker 1)  </w:t>
+          <w:color w:val="B52E2E"/>
+        </w:rPr>
+        <w:t xml:space="preserve">Varna (Speaker 1)  </w:t>
       </w:r>
       <w:r>
         <w:rPr>
@@ -21461,9 +21469,9 @@
       <w:r>
         <w:rPr>
           <w:b/>
-          <w:color w:val="2E74B5"/>
-        </w:rPr>
-        <w:t xml:space="preserve">Varna (moderator) (Speaker 1)  </w:t>
+          <w:color w:val="B52E2E"/>
+        </w:rPr>
+        <w:t xml:space="preserve">Varna (Speaker 1)  </w:t>
       </w:r>
       <w:r>
         <w:rPr>
@@ -21513,7 +21521,7 @@
           <w:b/>
           <w:color w:val="2E74B5"/>
         </w:rPr>
-        <w:t xml:space="preserve">Arun Nagar (Speaker 14)  </w:t>
+        <w:t xml:space="preserve">Speaker 14 (name unclear)  </w:t>
       </w:r>
       <w:r>
         <w:rPr>
@@ -21563,7 +21571,7 @@
           <w:b/>
           <w:color w:val="2E74B5"/>
         </w:rPr>
-        <w:t xml:space="preserve">Arun Nagar (Speaker 14)  </w:t>
+        <w:t xml:space="preserve">Speaker 14 (name unclear)  </w:t>
       </w:r>
       <w:r>
         <w:rPr>
@@ -21613,7 +21621,7 @@
           <w:b/>
           <w:color w:val="2E74B5"/>
         </w:rPr>
-        <w:t xml:space="preserve">Arun Nagar (Speaker 14)  </w:t>
+        <w:t xml:space="preserve">Speaker 14 (name unclear)  </w:t>
       </w:r>
       <w:r>
         <w:rPr>
@@ -21663,7 +21671,7 @@
           <w:b/>
           <w:color w:val="2E74B5"/>
         </w:rPr>
-        <w:t xml:space="preserve">Arun Nagar (Speaker 14)  </w:t>
+        <w:t xml:space="preserve">Speaker 14 (name unclear)  </w:t>
       </w:r>
       <w:r>
         <w:rPr>
@@ -21713,7 +21721,7 @@
           <w:b/>
           <w:color w:val="2E74B5"/>
         </w:rPr>
-        <w:t xml:space="preserve">Arun Nagar (Speaker 14)  </w:t>
+        <w:t xml:space="preserve">Speaker 14 (name unclear)  </w:t>
       </w:r>
       <w:r>
         <w:rPr>
@@ -21813,7 +21821,7 @@
           <w:b/>
           <w:color w:val="2E74B5"/>
         </w:rPr>
-        <w:t xml:space="preserve">Arun Nagar (Speaker 14)  </w:t>
+        <w:t xml:space="preserve">Speaker 14 (name unclear)  </w:t>
       </w:r>
       <w:r>
         <w:rPr>
@@ -21888,7 +21896,7 @@
           <w:b/>
           <w:color w:val="2E74B5"/>
         </w:rPr>
-        <w:t xml:space="preserve">Arun Nagar (Speaker 14)  </w:t>
+        <w:t xml:space="preserve">Speaker 14 (name unclear)  </w:t>
       </w:r>
       <w:r>
         <w:rPr>
@@ -21938,7 +21946,7 @@
           <w:b/>
           <w:color w:val="2E74B5"/>
         </w:rPr>
-        <w:t xml:space="preserve">Arun Nagar (Speaker 14)  </w:t>
+        <w:t xml:space="preserve">Speaker 14 (name unclear)  </w:t>
       </w:r>
       <w:r>
         <w:rPr>
@@ -21961,9 +21969,9 @@
       <w:r>
         <w:rPr>
           <w:b/>
-          <w:color w:val="2E74B5"/>
-        </w:rPr>
-        <w:t xml:space="preserve">Varna (moderator) (Speaker 1)  </w:t>
+          <w:color w:val="B52E2E"/>
+        </w:rPr>
+        <w:t xml:space="preserve">Varna (Speaker 1)  </w:t>
       </w:r>
       <w:r>
         <w:rPr>
@@ -21986,9 +21994,9 @@
       <w:r>
         <w:rPr>
           <w:b/>
-          <w:color w:val="2E74B5"/>
-        </w:rPr>
-        <w:t xml:space="preserve">Speaker 17  </w:t>
+          <w:color w:val="B52E2E"/>
+        </w:rPr>
+        <w:t xml:space="preserve">Yuvraj (Speaker 17)  </w:t>
       </w:r>
       <w:r>
         <w:rPr>
@@ -22011,9 +22019,9 @@
       <w:r>
         <w:rPr>
           <w:b/>
-          <w:color w:val="2E74B5"/>
-        </w:rPr>
-        <w:t xml:space="preserve">Varna (moderator) (Speaker 1)  </w:t>
+          <w:color w:val="B52E2E"/>
+        </w:rPr>
+        <w:t xml:space="preserve">Varna (Speaker 1)  </w:t>
       </w:r>
       <w:r>
         <w:rPr>
@@ -22036,9 +22044,9 @@
       <w:r>
         <w:rPr>
           <w:b/>
-          <w:color w:val="2E74B5"/>
-        </w:rPr>
-        <w:t xml:space="preserve">Speaker 17  </w:t>
+          <w:color w:val="B52E2E"/>
+        </w:rPr>
+        <w:t xml:space="preserve">Yuvraj (Speaker 17)  </w:t>
       </w:r>
       <w:r>
         <w:rPr>
@@ -22061,9 +22069,9 @@
       <w:r>
         <w:rPr>
           <w:b/>
-          <w:color w:val="2E74B5"/>
-        </w:rPr>
-        <w:t xml:space="preserve">Varna (moderator) (Speaker 1)  </w:t>
+          <w:color w:val="B52E2E"/>
+        </w:rPr>
+        <w:t xml:space="preserve">Varna (Speaker 1)  </w:t>
       </w:r>
       <w:r>
         <w:rPr>
@@ -22086,9 +22094,9 @@
       <w:r>
         <w:rPr>
           <w:b/>
-          <w:color w:val="2E74B5"/>
-        </w:rPr>
-        <w:t xml:space="preserve">Speaker 17  </w:t>
+          <w:color w:val="B52E2E"/>
+        </w:rPr>
+        <w:t xml:space="preserve">Yuvraj (Speaker 17)  </w:t>
       </w:r>
       <w:r>
         <w:rPr>
@@ -22111,9 +22119,9 @@
       <w:r>
         <w:rPr>
           <w:b/>
-          <w:color w:val="2E74B5"/>
-        </w:rPr>
-        <w:t xml:space="preserve">Varna (moderator) (Speaker 1)  </w:t>
+          <w:color w:val="B52E2E"/>
+        </w:rPr>
+        <w:t xml:space="preserve">Varna (Speaker 1)  </w:t>
       </w:r>
       <w:r>
         <w:rPr>
@@ -22161,9 +22169,9 @@
       <w:r>
         <w:rPr>
           <w:b/>
-          <w:color w:val="2E74B5"/>
-        </w:rPr>
-        <w:t xml:space="preserve">Speaker 17  </w:t>
+          <w:color w:val="B52E2E"/>
+        </w:rPr>
+        <w:t xml:space="preserve">Yuvraj (Speaker 17)  </w:t>
       </w:r>
       <w:r>
         <w:rPr>
@@ -22211,9 +22219,9 @@
       <w:r>
         <w:rPr>
           <w:b/>
-          <w:color w:val="2E74B5"/>
-        </w:rPr>
-        <w:t xml:space="preserve">Speaker 17  </w:t>
+          <w:color w:val="B52E2E"/>
+        </w:rPr>
+        <w:t xml:space="preserve">Yuvraj (Speaker 17)  </w:t>
       </w:r>
       <w:r>
         <w:rPr>
@@ -22286,9 +22294,9 @@
       <w:r>
         <w:rPr>
           <w:b/>
-          <w:color w:val="2E74B5"/>
-        </w:rPr>
-        <w:t xml:space="preserve">Speaker 17  </w:t>
+          <w:color w:val="B52E2E"/>
+        </w:rPr>
+        <w:t xml:space="preserve">Yuvraj (Speaker 17)  </w:t>
       </w:r>
       <w:r>
         <w:rPr>
@@ -22411,9 +22419,9 @@
       <w:r>
         <w:rPr>
           <w:b/>
-          <w:color w:val="2E74B5"/>
-        </w:rPr>
-        <w:t xml:space="preserve">Speaker 17  </w:t>
+          <w:color w:val="B52E2E"/>
+        </w:rPr>
+        <w:t xml:space="preserve">Yuvraj (Speaker 17)  </w:t>
       </w:r>
       <w:r>
         <w:rPr>
@@ -22461,9 +22469,9 @@
       <w:r>
         <w:rPr>
           <w:b/>
-          <w:color w:val="2E74B5"/>
-        </w:rPr>
-        <w:t xml:space="preserve">Speaker 17  </w:t>
+          <w:color w:val="B52E2E"/>
+        </w:rPr>
+        <w:t xml:space="preserve">Yuvraj (Speaker 17)  </w:t>
       </w:r>
       <w:r>
         <w:rPr>
@@ -22536,9 +22544,9 @@
       <w:r>
         <w:rPr>
           <w:b/>
-          <w:color w:val="2E74B5"/>
-        </w:rPr>
-        <w:t xml:space="preserve">Speaker 17  </w:t>
+          <w:color w:val="B52E2E"/>
+        </w:rPr>
+        <w:t xml:space="preserve">Yuvraj (Speaker 17)  </w:t>
       </w:r>
       <w:r>
         <w:rPr>
@@ -22611,9 +22619,9 @@
       <w:r>
         <w:rPr>
           <w:b/>
-          <w:color w:val="2E74B5"/>
-        </w:rPr>
-        <w:t xml:space="preserve">Speaker 17  </w:t>
+          <w:color w:val="B52E2E"/>
+        </w:rPr>
+        <w:t xml:space="preserve">Yuvraj (Speaker 17)  </w:t>
       </w:r>
       <w:r>
         <w:rPr>
@@ -22661,9 +22669,9 @@
       <w:r>
         <w:rPr>
           <w:b/>
-          <w:color w:val="2E74B5"/>
-        </w:rPr>
-        <w:t xml:space="preserve">Speaker 17  </w:t>
+          <w:color w:val="B52E2E"/>
+        </w:rPr>
+        <w:t xml:space="preserve">Yuvraj (Speaker 17)  </w:t>
       </w:r>
       <w:r>
         <w:rPr>
@@ -22711,9 +22719,9 @@
       <w:r>
         <w:rPr>
           <w:b/>
-          <w:color w:val="2E74B5"/>
-        </w:rPr>
-        <w:t xml:space="preserve">Speaker 17  </w:t>
+          <w:color w:val="B52E2E"/>
+        </w:rPr>
+        <w:t xml:space="preserve">Yuvraj (Speaker 17)  </w:t>
       </w:r>
       <w:r>
         <w:rPr>
@@ -22761,9 +22769,9 @@
       <w:r>
         <w:rPr>
           <w:b/>
-          <w:color w:val="2E74B5"/>
-        </w:rPr>
-        <w:t xml:space="preserve">Speaker 17  </w:t>
+          <w:color w:val="B52E2E"/>
+        </w:rPr>
+        <w:t xml:space="preserve">Yuvraj (Speaker 17)  </w:t>
       </w:r>
       <w:r>
         <w:rPr>
@@ -22786,9 +22794,9 @@
       <w:r>
         <w:rPr>
           <w:b/>
-          <w:color w:val="2E74B5"/>
-        </w:rPr>
-        <w:t xml:space="preserve">Varna (moderator) (Speaker 1)  </w:t>
+          <w:color w:val="B52E2E"/>
+        </w:rPr>
+        <w:t xml:space="preserve">Varna (Speaker 1)  </w:t>
       </w:r>
       <w:r>
         <w:rPr>
@@ -22836,9 +22844,9 @@
       <w:r>
         <w:rPr>
           <w:b/>
-          <w:color w:val="2E74B5"/>
-        </w:rPr>
-        <w:t xml:space="preserve">Speaker 17  </w:t>
+          <w:color w:val="B52E2E"/>
+        </w:rPr>
+        <w:t xml:space="preserve">Yuvraj (Speaker 17)  </w:t>
       </w:r>
       <w:r>
         <w:rPr>
@@ -22886,9 +22894,9 @@
       <w:r>
         <w:rPr>
           <w:b/>
-          <w:color w:val="2E74B5"/>
-        </w:rPr>
-        <w:t xml:space="preserve">Speaker 17  </w:t>
+          <w:color w:val="B52E2E"/>
+        </w:rPr>
+        <w:t xml:space="preserve">Yuvraj (Speaker 17)  </w:t>
       </w:r>
       <w:r>
         <w:rPr>
@@ -22936,9 +22944,9 @@
       <w:r>
         <w:rPr>
           <w:b/>
-          <w:color w:val="2E74B5"/>
-        </w:rPr>
-        <w:t xml:space="preserve">Speaker 17  </w:t>
+          <w:color w:val="B52E2E"/>
+        </w:rPr>
+        <w:t xml:space="preserve">Yuvraj (Speaker 17)  </w:t>
       </w:r>
       <w:r>
         <w:rPr>
@@ -22986,9 +22994,9 @@
       <w:r>
         <w:rPr>
           <w:b/>
-          <w:color w:val="2E74B5"/>
-        </w:rPr>
-        <w:t xml:space="preserve">Speaker 17  </w:t>
+          <w:color w:val="B52E2E"/>
+        </w:rPr>
+        <w:t xml:space="preserve">Yuvraj (Speaker 17)  </w:t>
       </w:r>
       <w:r>
         <w:rPr>
@@ -23061,9 +23069,9 @@
       <w:r>
         <w:rPr>
           <w:b/>
-          <w:color w:val="2E74B5"/>
-        </w:rPr>
-        <w:t xml:space="preserve">Varna (moderator) (Speaker 1)  </w:t>
+          <w:color w:val="B52E2E"/>
+        </w:rPr>
+        <w:t xml:space="preserve">Varna (Speaker 1)  </w:t>
       </w:r>
       <w:r>
         <w:rPr>
@@ -23111,9 +23119,9 @@
       <w:r>
         <w:rPr>
           <w:b/>
-          <w:color w:val="2E74B5"/>
-        </w:rPr>
-        <w:t xml:space="preserve">Varna (moderator) (Speaker 1)  </w:t>
+          <w:color w:val="B52E2E"/>
+        </w:rPr>
+        <w:t xml:space="preserve">Varna (Speaker 1)  </w:t>
       </w:r>
       <w:r>
         <w:rPr>
@@ -23161,9 +23169,9 @@
       <w:r>
         <w:rPr>
           <w:b/>
-          <w:color w:val="2E74B5"/>
-        </w:rPr>
-        <w:t xml:space="preserve">Varna (moderator) (Speaker 1)  </w:t>
+          <w:color w:val="B52E2E"/>
+        </w:rPr>
+        <w:t xml:space="preserve">Varna (Speaker 1)  </w:t>
       </w:r>
       <w:r>
         <w:rPr>
@@ -23336,9 +23344,9 @@
       <w:r>
         <w:rPr>
           <w:b/>
-          <w:color w:val="2E74B5"/>
-        </w:rPr>
-        <w:t xml:space="preserve">Speaker 17  </w:t>
+          <w:color w:val="B52E2E"/>
+        </w:rPr>
+        <w:t xml:space="preserve">Yuvraj (Speaker 17)  </w:t>
       </w:r>
       <w:r>
         <w:rPr>
@@ -23386,9 +23394,9 @@
       <w:r>
         <w:rPr>
           <w:b/>
-          <w:color w:val="2E74B5"/>
-        </w:rPr>
-        <w:t xml:space="preserve">Speaker 17  </w:t>
+          <w:color w:val="B52E2E"/>
+        </w:rPr>
+        <w:t xml:space="preserve">Yuvraj (Speaker 17)  </w:t>
       </w:r>
       <w:r>
         <w:rPr>
@@ -23436,9 +23444,9 @@
       <w:r>
         <w:rPr>
           <w:b/>
-          <w:color w:val="2E74B5"/>
-        </w:rPr>
-        <w:t xml:space="preserve">Speaker 17  </w:t>
+          <w:color w:val="B52E2E"/>
+        </w:rPr>
+        <w:t xml:space="preserve">Yuvraj (Speaker 17)  </w:t>
       </w:r>
       <w:r>
         <w:rPr>
@@ -23486,9 +23494,9 @@
       <w:r>
         <w:rPr>
           <w:b/>
-          <w:color w:val="2E74B5"/>
-        </w:rPr>
-        <w:t xml:space="preserve">Speaker 17  </w:t>
+          <w:color w:val="B52E2E"/>
+        </w:rPr>
+        <w:t xml:space="preserve">Yuvraj (Speaker 17)  </w:t>
       </w:r>
       <w:r>
         <w:rPr>
@@ -23536,9 +23544,9 @@
       <w:r>
         <w:rPr>
           <w:b/>
-          <w:color w:val="2E74B5"/>
-        </w:rPr>
-        <w:t xml:space="preserve">Speaker 17  </w:t>
+          <w:color w:val="B52E2E"/>
+        </w:rPr>
+        <w:t xml:space="preserve">Yuvraj (Speaker 17)  </w:t>
       </w:r>
       <w:r>
         <w:rPr>
@@ -23661,9 +23669,9 @@
       <w:r>
         <w:rPr>
           <w:b/>
-          <w:color w:val="2E74B5"/>
-        </w:rPr>
-        <w:t xml:space="preserve">Speaker 17  </w:t>
+          <w:color w:val="B52E2E"/>
+        </w:rPr>
+        <w:t xml:space="preserve">Yuvraj (Speaker 17)  </w:t>
       </w:r>
       <w:r>
         <w:rPr>
@@ -23711,9 +23719,9 @@
       <w:r>
         <w:rPr>
           <w:b/>
-          <w:color w:val="2E74B5"/>
-        </w:rPr>
-        <w:t xml:space="preserve">Speaker 17  </w:t>
+          <w:color w:val="B52E2E"/>
+        </w:rPr>
+        <w:t xml:space="preserve">Yuvraj (Speaker 17)  </w:t>
       </w:r>
       <w:r>
         <w:rPr>
@@ -23736,9 +23744,9 @@
       <w:r>
         <w:rPr>
           <w:b/>
-          <w:color w:val="2E74B5"/>
-        </w:rPr>
-        <w:t xml:space="preserve">Varna (moderator) (Speaker 1)  </w:t>
+          <w:color w:val="B52E2E"/>
+        </w:rPr>
+        <w:t xml:space="preserve">Varna (Speaker 1)  </w:t>
       </w:r>
       <w:r>
         <w:rPr>
@@ -23786,9 +23794,9 @@
       <w:r>
         <w:rPr>
           <w:b/>
-          <w:color w:val="2E74B5"/>
-        </w:rPr>
-        <w:t xml:space="preserve">Speaker 17  </w:t>
+          <w:color w:val="B52E2E"/>
+        </w:rPr>
+        <w:t xml:space="preserve">Yuvraj (Speaker 17)  </w:t>
       </w:r>
       <w:r>
         <w:rPr>
@@ -23836,9 +23844,9 @@
       <w:r>
         <w:rPr>
           <w:b/>
-          <w:color w:val="2E74B5"/>
-        </w:rPr>
-        <w:t xml:space="preserve">Speaker 17  </w:t>
+          <w:color w:val="B52E2E"/>
+        </w:rPr>
+        <w:t xml:space="preserve">Yuvraj (Speaker 17)  </w:t>
       </w:r>
       <w:r>
         <w:rPr>
@@ -23886,9 +23894,9 @@
       <w:r>
         <w:rPr>
           <w:b/>
-          <w:color w:val="2E74B5"/>
-        </w:rPr>
-        <w:t xml:space="preserve">Speaker 17  </w:t>
+          <w:color w:val="B52E2E"/>
+        </w:rPr>
+        <w:t xml:space="preserve">Yuvraj (Speaker 17)  </w:t>
       </w:r>
       <w:r>
         <w:rPr>
@@ -23961,9 +23969,9 @@
       <w:r>
         <w:rPr>
           <w:b/>
-          <w:color w:val="2E74B5"/>
-        </w:rPr>
-        <w:t xml:space="preserve">Speaker 17  </w:t>
+          <w:color w:val="B52E2E"/>
+        </w:rPr>
+        <w:t xml:space="preserve">Yuvraj (Speaker 17)  </w:t>
       </w:r>
       <w:r>
         <w:rPr>
@@ -24036,9 +24044,9 @@
       <w:r>
         <w:rPr>
           <w:b/>
-          <w:color w:val="2E74B5"/>
-        </w:rPr>
-        <w:t xml:space="preserve">Speaker 17  </w:t>
+          <w:color w:val="B52E2E"/>
+        </w:rPr>
+        <w:t xml:space="preserve">Yuvraj (Speaker 17)  </w:t>
       </w:r>
       <w:r>
         <w:rPr>
@@ -24186,9 +24194,9 @@
       <w:r>
         <w:rPr>
           <w:b/>
-          <w:color w:val="2E74B5"/>
-        </w:rPr>
-        <w:t xml:space="preserve">Speaker 17  </w:t>
+          <w:color w:val="B52E2E"/>
+        </w:rPr>
+        <w:t xml:space="preserve">Yuvraj (Speaker 17)  </w:t>
       </w:r>
       <w:r>
         <w:rPr>
@@ -24236,9 +24244,9 @@
       <w:r>
         <w:rPr>
           <w:b/>
-          <w:color w:val="2E74B5"/>
-        </w:rPr>
-        <w:t xml:space="preserve">Speaker 17  </w:t>
+          <w:color w:val="B52E2E"/>
+        </w:rPr>
+        <w:t xml:space="preserve">Yuvraj (Speaker 17)  </w:t>
       </w:r>
       <w:r>
         <w:rPr>
@@ -24286,9 +24294,9 @@
       <w:r>
         <w:rPr>
           <w:b/>
-          <w:color w:val="2E74B5"/>
-        </w:rPr>
-        <w:t xml:space="preserve">Speaker 17  </w:t>
+          <w:color w:val="B52E2E"/>
+        </w:rPr>
+        <w:t xml:space="preserve">Yuvraj (Speaker 17)  </w:t>
       </w:r>
       <w:r>
         <w:rPr>
@@ -24336,9 +24344,9 @@
       <w:r>
         <w:rPr>
           <w:b/>
-          <w:color w:val="2E74B5"/>
-        </w:rPr>
-        <w:t xml:space="preserve">Speaker 17  </w:t>
+          <w:color w:val="B52E2E"/>
+        </w:rPr>
+        <w:t xml:space="preserve">Yuvraj (Speaker 17)  </w:t>
       </w:r>
       <w:r>
         <w:rPr>
@@ -24436,9 +24444,9 @@
       <w:r>
         <w:rPr>
           <w:b/>
-          <w:color w:val="2E74B5"/>
-        </w:rPr>
-        <w:t xml:space="preserve">Speaker 17  </w:t>
+          <w:color w:val="B52E2E"/>
+        </w:rPr>
+        <w:t xml:space="preserve">Yuvraj (Speaker 17)  </w:t>
       </w:r>
       <w:r>
         <w:rPr>
@@ -24588,7 +24596,7 @@
           <w:b/>
           <w:color w:val="2E74B5"/>
         </w:rPr>
-        <w:t xml:space="preserve">Arun Nagar (Speaker 14)  </w:t>
+        <w:t xml:space="preserve">Speaker 14 (name unclear)  </w:t>
       </w:r>
       <w:r>
         <w:rPr>
@@ -24636,9 +24644,9 @@
       <w:r>
         <w:rPr>
           <w:b/>
-          <w:color w:val="2E74B5"/>
-        </w:rPr>
-        <w:t xml:space="preserve">Speaker 17  </w:t>
+          <w:color w:val="B52E2E"/>
+        </w:rPr>
+        <w:t xml:space="preserve">Yuvraj (Speaker 17)  </w:t>
       </w:r>
       <w:r>
         <w:rPr>
@@ -24686,9 +24694,9 @@
       <w:r>
         <w:rPr>
           <w:b/>
-          <w:color w:val="2E74B5"/>
-        </w:rPr>
-        <w:t xml:space="preserve">Speaker 17  </w:t>
+          <w:color w:val="B52E2E"/>
+        </w:rPr>
+        <w:t xml:space="preserve">Yuvraj (Speaker 17)  </w:t>
       </w:r>
       <w:r>
         <w:rPr>
@@ -24738,7 +24746,7 @@
           <w:b/>
           <w:color w:val="2E74B5"/>
         </w:rPr>
-        <w:t xml:space="preserve">Arun Nagar (Speaker 14)  </w:t>
+        <w:t xml:space="preserve">Speaker 14 (name unclear)  </w:t>
       </w:r>
       <w:r>
         <w:rPr>
@@ -24888,7 +24896,7 @@
           <w:b/>
           <w:color w:val="2E74B5"/>
         </w:rPr>
-        <w:t xml:space="preserve">Arun Nagar (Speaker 14)  </w:t>
+        <w:t xml:space="preserve">Speaker 14 (name unclear)  </w:t>
       </w:r>
       <w:r>
         <w:rPr>
@@ -24911,9 +24919,9 @@
       <w:r>
         <w:rPr>
           <w:b/>
-          <w:color w:val="2E74B5"/>
-        </w:rPr>
-        <w:t xml:space="preserve">Speaker 17  </w:t>
+          <w:color w:val="B52E2E"/>
+        </w:rPr>
+        <w:t xml:space="preserve">Yuvraj (Speaker 17)  </w:t>
       </w:r>
       <w:r>
         <w:rPr>
@@ -25061,9 +25069,9 @@
       <w:r>
         <w:rPr>
           <w:b/>
-          <w:color w:val="2E74B5"/>
-        </w:rPr>
-        <w:t xml:space="preserve">Speaker 17  </w:t>
+          <w:color w:val="B52E2E"/>
+        </w:rPr>
+        <w:t xml:space="preserve">Yuvraj (Speaker 17)  </w:t>
       </w:r>
       <w:r>
         <w:rPr>
@@ -25113,7 +25121,7 @@
           <w:b/>
           <w:color w:val="2E74B5"/>
         </w:rPr>
-        <w:t xml:space="preserve">Arun Nagar (Speaker 14)  </w:t>
+        <w:t xml:space="preserve">Speaker 14 (name unclear)  </w:t>
       </w:r>
       <w:r>
         <w:rPr>
@@ -25238,7 +25246,7 @@
           <w:b/>
           <w:color w:val="2E74B5"/>
         </w:rPr>
-        <w:t xml:space="preserve">Arun Nagar (Speaker 14)  </w:t>
+        <w:t xml:space="preserve">Speaker 14 (name unclear)  </w:t>
       </w:r>
       <w:r>
         <w:rPr>
@@ -25286,9 +25294,9 @@
       <w:r>
         <w:rPr>
           <w:b/>
-          <w:color w:val="2E74B5"/>
-        </w:rPr>
-        <w:t xml:space="preserve">Varna (moderator) (Speaker 1)  </w:t>
+          <w:color w:val="B52E2E"/>
+        </w:rPr>
+        <w:t xml:space="preserve">Varna (Speaker 1)  </w:t>
       </w:r>
       <w:r>
         <w:rPr>
@@ -25311,9 +25319,9 @@
       <w:r>
         <w:rPr>
           <w:b/>
-          <w:color w:val="2E74B5"/>
-        </w:rPr>
-        <w:t xml:space="preserve">Speaker 17  </w:t>
+          <w:color w:val="B52E2E"/>
+        </w:rPr>
+        <w:t xml:space="preserve">Yuvraj (Speaker 17)  </w:t>
       </w:r>
       <w:r>
         <w:rPr>
@@ -25361,9 +25369,9 @@
       <w:r>
         <w:rPr>
           <w:b/>
-          <w:color w:val="2E74B5"/>
-        </w:rPr>
-        <w:t xml:space="preserve">Speaker 17  </w:t>
+          <w:color w:val="B52E2E"/>
+        </w:rPr>
+        <w:t xml:space="preserve">Yuvraj (Speaker 17)  </w:t>
       </w:r>
       <w:r>
         <w:rPr>
@@ -25561,9 +25569,9 @@
       <w:r>
         <w:rPr>
           <w:b/>
-          <w:color w:val="2E74B5"/>
-        </w:rPr>
-        <w:t xml:space="preserve">Speaker 17  </w:t>
+          <w:color w:val="B52E2E"/>
+        </w:rPr>
+        <w:t xml:space="preserve">Yuvraj (Speaker 17)  </w:t>
       </w:r>
       <w:r>
         <w:rPr>
@@ -25786,9 +25794,9 @@
       <w:r>
         <w:rPr>
           <w:b/>
-          <w:color w:val="2E74B5"/>
-        </w:rPr>
-        <w:t xml:space="preserve">Speaker 17  </w:t>
+          <w:color w:val="B52E2E"/>
+        </w:rPr>
+        <w:t xml:space="preserve">Yuvraj (Speaker 17)  </w:t>
       </w:r>
       <w:r>
         <w:rPr>
@@ -25836,9 +25844,9 @@
       <w:r>
         <w:rPr>
           <w:b/>
-          <w:color w:val="2E74B5"/>
-        </w:rPr>
-        <w:t xml:space="preserve">Varna (moderator) (Speaker 1)  </w:t>
+          <w:color w:val="B52E2E"/>
+        </w:rPr>
+        <w:t xml:space="preserve">Varna (Speaker 1)  </w:t>
       </w:r>
       <w:r>
         <w:rPr>
@@ -25886,9 +25894,9 @@
       <w:r>
         <w:rPr>
           <w:b/>
-          <w:color w:val="2E74B5"/>
-        </w:rPr>
-        <w:t xml:space="preserve">Varna (moderator) (Speaker 1)  </w:t>
+          <w:color w:val="B52E2E"/>
+        </w:rPr>
+        <w:t xml:space="preserve">Varna (Speaker 1)  </w:t>
       </w:r>
       <w:r>
         <w:rPr>
@@ -25936,9 +25944,9 @@
       <w:r>
         <w:rPr>
           <w:b/>
-          <w:color w:val="2E74B5"/>
-        </w:rPr>
-        <w:t xml:space="preserve">Varna (moderator) (Speaker 1)  </w:t>
+          <w:color w:val="B52E2E"/>
+        </w:rPr>
+        <w:t xml:space="preserve">Varna (Speaker 1)  </w:t>
       </w:r>
       <w:r>
         <w:rPr>
@@ -25986,9 +25994,9 @@
       <w:r>
         <w:rPr>
           <w:b/>
-          <w:color w:val="2E74B5"/>
-        </w:rPr>
-        <w:t xml:space="preserve">Varna (moderator) (Speaker 1)  </w:t>
+          <w:color w:val="B52E2E"/>
+        </w:rPr>
+        <w:t xml:space="preserve">Varna (Speaker 1)  </w:t>
       </w:r>
       <w:r>
         <w:rPr>
@@ -26036,9 +26044,9 @@
       <w:r>
         <w:rPr>
           <w:b/>
-          <w:color w:val="2E74B5"/>
-        </w:rPr>
-        <w:t xml:space="preserve">Varna (moderator) (Speaker 1)  </w:t>
+          <w:color w:val="B52E2E"/>
+        </w:rPr>
+        <w:t xml:space="preserve">Varna (Speaker 1)  </w:t>
       </w:r>
       <w:r>
         <w:rPr>
@@ -26111,9 +26119,9 @@
       <w:r>
         <w:rPr>
           <w:b/>
-          <w:color w:val="2E74B5"/>
-        </w:rPr>
-        <w:t xml:space="preserve">Varna (moderator) (Speaker 1)  </w:t>
+          <w:color w:val="B52E2E"/>
+        </w:rPr>
+        <w:t xml:space="preserve">Varna (Speaker 1)  </w:t>
       </w:r>
       <w:r>
         <w:rPr>
@@ -26611,9 +26619,9 @@
       <w:r>
         <w:rPr>
           <w:b/>
-          <w:color w:val="2E74B5"/>
-        </w:rPr>
-        <w:t xml:space="preserve">Varna (moderator) (Speaker 1)  </w:t>
+          <w:color w:val="B52E2E"/>
+        </w:rPr>
+        <w:t xml:space="preserve">Varna (Speaker 1)  </w:t>
       </w:r>
       <w:r>
         <w:rPr>
@@ -26661,9 +26669,9 @@
       <w:r>
         <w:rPr>
           <w:b/>
-          <w:color w:val="2E74B5"/>
-        </w:rPr>
-        <w:t xml:space="preserve">Varna (moderator) (Speaker 1)  </w:t>
+          <w:color w:val="B52E2E"/>
+        </w:rPr>
+        <w:t xml:space="preserve">Varna (Speaker 1)  </w:t>
       </w:r>
       <w:r>
         <w:rPr>
@@ -26711,9 +26719,9 @@
       <w:r>
         <w:rPr>
           <w:b/>
-          <w:color w:val="2E74B5"/>
-        </w:rPr>
-        <w:t xml:space="preserve">Varna (moderator) (Speaker 1)  </w:t>
+          <w:color w:val="B52E2E"/>
+        </w:rPr>
+        <w:t xml:space="preserve">Varna (Speaker 1)  </w:t>
       </w:r>
       <w:r>
         <w:rPr>
@@ -26736,9 +26744,9 @@
       <w:r>
         <w:rPr>
           <w:b/>
-          <w:color w:val="2E74B5"/>
-        </w:rPr>
-        <w:t xml:space="preserve">Speaker 17  </w:t>
+          <w:color w:val="B52E2E"/>
+        </w:rPr>
+        <w:t xml:space="preserve">Yuvraj (Speaker 17)  </w:t>
       </w:r>
       <w:r>
         <w:rPr>
@@ -26761,9 +26769,9 @@
       <w:r>
         <w:rPr>
           <w:b/>
-          <w:color w:val="2E74B5"/>
-        </w:rPr>
-        <w:t xml:space="preserve">Varna (moderator) (Speaker 1)  </w:t>
+          <w:color w:val="B52E2E"/>
+        </w:rPr>
+        <w:t xml:space="preserve">Varna (Speaker 1)  </w:t>
       </w:r>
       <w:r>
         <w:rPr>
@@ -26786,9 +26794,9 @@
       <w:r>
         <w:rPr>
           <w:b/>
-          <w:color w:val="2E74B5"/>
-        </w:rPr>
-        <w:t xml:space="preserve">Speaker 17  </w:t>
+          <w:color w:val="B52E2E"/>
+        </w:rPr>
+        <w:t xml:space="preserve">Yuvraj (Speaker 17)  </w:t>
       </w:r>
       <w:r>
         <w:rPr>
@@ -26811,9 +26819,9 @@
       <w:r>
         <w:rPr>
           <w:b/>
-          <w:color w:val="2E74B5"/>
-        </w:rPr>
-        <w:t xml:space="preserve">Varna (moderator) (Speaker 1)  </w:t>
+          <w:color w:val="B52E2E"/>
+        </w:rPr>
+        <w:t xml:space="preserve">Varna (Speaker 1)  </w:t>
       </w:r>
       <w:r>
         <w:rPr>
@@ -26836,9 +26844,9 @@
       <w:r>
         <w:rPr>
           <w:b/>
-          <w:color w:val="2E74B5"/>
-        </w:rPr>
-        <w:t xml:space="preserve">Speaker 17  </w:t>
+          <w:color w:val="B52E2E"/>
+        </w:rPr>
+        <w:t xml:space="preserve">Yuvraj (Speaker 17)  </w:t>
       </w:r>
       <w:r>
         <w:rPr>
@@ -26861,9 +26869,9 @@
       <w:r>
         <w:rPr>
           <w:b/>
-          <w:color w:val="2E74B5"/>
-        </w:rPr>
-        <w:t xml:space="preserve">Varna (moderator) (Speaker 1)  </w:t>
+          <w:color w:val="B52E2E"/>
+        </w:rPr>
+        <w:t xml:space="preserve">Varna (Speaker 1)  </w:t>
       </w:r>
       <w:r>
         <w:rPr>
@@ -26886,9 +26894,9 @@
       <w:r>
         <w:rPr>
           <w:b/>
-          <w:color w:val="2E74B5"/>
-        </w:rPr>
-        <w:t xml:space="preserve">Speaker 17  </w:t>
+          <w:color w:val="B52E2E"/>
+        </w:rPr>
+        <w:t xml:space="preserve">Yuvraj (Speaker 17)  </w:t>
       </w:r>
       <w:r>
         <w:rPr>
@@ -26944,9 +26952,9 @@
       <w:r>
         <w:rPr>
           <w:b/>
-          <w:color w:val="2E74B5"/>
-        </w:rPr>
-        <w:t xml:space="preserve">Varna (moderator) (Speaker 1)  </w:t>
+          <w:color w:val="B52E2E"/>
+        </w:rPr>
+        <w:t xml:space="preserve">Varna (Speaker 1)  </w:t>
       </w:r>
       <w:r>
         <w:rPr>
@@ -26969,9 +26977,9 @@
       <w:r>
         <w:rPr>
           <w:b/>
-          <w:color w:val="2E74B5"/>
-        </w:rPr>
-        <w:t xml:space="preserve">Speaker 17  </w:t>
+          <w:color w:val="B52E2E"/>
+        </w:rPr>
+        <w:t xml:space="preserve">Yuvraj (Speaker 17)  </w:t>
       </w:r>
       <w:r>
         <w:rPr>
@@ -26994,9 +27002,9 @@
       <w:r>
         <w:rPr>
           <w:b/>
-          <w:color w:val="2E74B5"/>
-        </w:rPr>
-        <w:t xml:space="preserve">Varna (moderator) (Speaker 1)  </w:t>
+          <w:color w:val="B52E2E"/>
+        </w:rPr>
+        <w:t xml:space="preserve">Varna (Speaker 1)  </w:t>
       </w:r>
       <w:r>
         <w:rPr>
@@ -27019,9 +27027,9 @@
       <w:r>
         <w:rPr>
           <w:b/>
-          <w:color w:val="2E74B5"/>
-        </w:rPr>
-        <w:t xml:space="preserve">Speaker 17  </w:t>
+          <w:color w:val="B52E2E"/>
+        </w:rPr>
+        <w:t xml:space="preserve">Yuvraj (Speaker 17)  </w:t>
       </w:r>
       <w:r>
         <w:rPr>
@@ -27044,9 +27052,9 @@
       <w:r>
         <w:rPr>
           <w:b/>
-          <w:color w:val="2E74B5"/>
-        </w:rPr>
-        <w:t xml:space="preserve">Varna (moderator) (Speaker 1)  </w:t>
+          <w:color w:val="B52E2E"/>
+        </w:rPr>
+        <w:t xml:space="preserve">Varna (Speaker 1)  </w:t>
       </w:r>
       <w:r>
         <w:rPr>

</xml_diff>